<commit_message>
Fetched the data in revenue allocation
</commit_message>
<xml_diff>
--- a/OtherPaymentDetails.docx
+++ b/OtherPaymentDetails.docx
@@ -30,7 +30,6 @@
               <w:bCs/>
             </w:rPr>
           </w:pPr>
-          <w:proofErr w:type="spellStart"/>
           <w:r>
             <w:rPr>
               <w:b/>
@@ -38,7 +37,6 @@
             </w:rPr>
             <w:t>CurrentDate</w:t>
           </w:r>
-          <w:proofErr w:type="spellEnd"/>
         </w:p>
       </w:sdtContent>
     </w:sdt>
@@ -57,17 +55,16 @@
             <w:b/>
             <w:bCs/>
           </w:rPr>
+          <w:alias w:val="#Nav: /TenancyContractSubpage/Customer_Name"/>
+          <w:tag w:val="#Nav: Other_Payment_Details/50110"/>
           <w:id w:val="-723454796"/>
           <w:placeholder>
             <w:docPart w:val="DefaultPlaceholder_-1854013440"/>
           </w:placeholder>
           <w:dataBinding w:prefixMappings="xmlns:ns0='urn:microsoft-dynamics-nav/reports/Other_Payment_Details/50110/'" w:xpath="/ns0:NavWordReportXmlPart[1]/ns0:TenancyContractSubpage[1]/ns0:Customer_Name[1]" w:storeItemID="{1B288537-E1B4-496E-895B-159FCB78FD89}"/>
           <w:text/>
-          <w:alias w:val="#Nav: /TenancyContractSubpage/Customer_Name"/>
-          <w:tag w:val="#Nav: Other_Payment_Details/50110"/>
         </w:sdtPr>
         <w:sdtContent>
-          <w:proofErr w:type="spellStart"/>
           <w:r>
             <w:rPr>
               <w:b/>
@@ -75,7 +72,6 @@
             </w:rPr>
             <w:t>Customer_Name</w:t>
           </w:r>
-          <w:proofErr w:type="spellEnd"/>
         </w:sdtContent>
       </w:sdt>
     </w:p>
@@ -98,17 +94,18 @@
     <w:tbl>
       <w:tblPr>
         <w:tblStyle w:val="TableGrid"/>
-        <w:tblW w:w="0" w:type="auto"/>
+        <w:tblW w:w="10206" w:type="dxa"/>
+        <w:tblInd w:w="-5" w:type="dxa"/>
         <w:tblLook w:val="04A0" w:firstRow="1" w:lastRow="0" w:firstColumn="1" w:lastColumn="0" w:noHBand="0" w:noVBand="1"/>
       </w:tblPr>
       <w:tblGrid>
-        <w:gridCol w:w="4814"/>
-        <w:gridCol w:w="4814"/>
+        <w:gridCol w:w="5245"/>
+        <w:gridCol w:w="4961"/>
       </w:tblGrid>
       <w:tr>
         <w:tc>
           <w:tcPr>
-            <w:tcW w:w="4814" w:type="dxa"/>
+            <w:tcW w:w="5245" w:type="dxa"/>
             <w:tcBorders>
               <w:bottom w:val="nil"/>
             </w:tcBorders>
@@ -147,14 +144,12 @@
                 <w:text/>
               </w:sdtPr>
               <w:sdtContent>
-                <w:proofErr w:type="spellStart"/>
                 <w:r>
                   <w:rPr>
                     <w:bCs/>
                   </w:rPr>
                   <w:t>ProposalID</w:t>
                 </w:r>
-                <w:proofErr w:type="spellEnd"/>
               </w:sdtContent>
             </w:sdt>
             <w:r>
@@ -167,7 +162,7 @@
         </w:tc>
         <w:tc>
           <w:tcPr>
-            <w:tcW w:w="4814" w:type="dxa"/>
+            <w:tcW w:w="4961" w:type="dxa"/>
             <w:tcBorders>
               <w:bottom w:val="nil"/>
             </w:tcBorders>
@@ -206,14 +201,12 @@
                 <w:text/>
               </w:sdtPr>
               <w:sdtContent>
-                <w:proofErr w:type="spellStart"/>
                 <w:r>
                   <w:rPr>
                     <w:bCs/>
                   </w:rPr>
                   <w:t>Property_Name</w:t>
                 </w:r>
-                <w:proofErr w:type="spellEnd"/>
               </w:sdtContent>
             </w:sdt>
             <w:r>
@@ -228,7 +221,7 @@
       <w:tr>
         <w:tc>
           <w:tcPr>
-            <w:tcW w:w="4814" w:type="dxa"/>
+            <w:tcW w:w="5245" w:type="dxa"/>
             <w:tcBorders>
               <w:top w:val="nil"/>
               <w:bottom w:val="nil"/>
@@ -267,21 +260,19 @@
                 <w:text/>
               </w:sdtPr>
               <w:sdtContent>
-                <w:proofErr w:type="spellStart"/>
                 <w:r>
                   <w:rPr>
                     <w:bCs/>
                   </w:rPr>
                   <w:t>Start_Date</w:t>
                 </w:r>
-                <w:proofErr w:type="spellEnd"/>
               </w:sdtContent>
             </w:sdt>
           </w:p>
         </w:tc>
         <w:tc>
           <w:tcPr>
-            <w:tcW w:w="4814" w:type="dxa"/>
+            <w:tcW w:w="4961" w:type="dxa"/>
             <w:tcBorders>
               <w:top w:val="nil"/>
               <w:bottom w:val="nil"/>
@@ -327,14 +318,12 @@
                 <w:text/>
               </w:sdtPr>
               <w:sdtContent>
-                <w:proofErr w:type="spellStart"/>
                 <w:r>
                   <w:rPr>
                     <w:bCs/>
                   </w:rPr>
                   <w:t>Unit_Name</w:t>
                 </w:r>
-                <w:proofErr w:type="spellEnd"/>
               </w:sdtContent>
             </w:sdt>
             <w:r>
@@ -349,7 +338,7 @@
       <w:tr>
         <w:tc>
           <w:tcPr>
-            <w:tcW w:w="4814" w:type="dxa"/>
+            <w:tcW w:w="5245" w:type="dxa"/>
             <w:tcBorders>
               <w:top w:val="nil"/>
             </w:tcBorders>
@@ -387,21 +376,19 @@
                 <w:text/>
               </w:sdtPr>
               <w:sdtContent>
-                <w:proofErr w:type="spellStart"/>
                 <w:r>
                   <w:rPr>
                     <w:bCs/>
                   </w:rPr>
                   <w:t>End_Date</w:t>
                 </w:r>
-                <w:proofErr w:type="spellEnd"/>
               </w:sdtContent>
             </w:sdt>
           </w:p>
         </w:tc>
         <w:tc>
           <w:tcPr>
-            <w:tcW w:w="4814" w:type="dxa"/>
+            <w:tcW w:w="4961" w:type="dxa"/>
             <w:tcBorders>
               <w:top w:val="nil"/>
             </w:tcBorders>
@@ -439,14 +426,12 @@
                 <w:text/>
               </w:sdtPr>
               <w:sdtContent>
-                <w:proofErr w:type="spellStart"/>
                 <w:r>
                   <w:rPr>
                     <w:bCs/>
                   </w:rPr>
                   <w:t>Unit_Size</w:t>
                 </w:r>
-                <w:proofErr w:type="spellEnd"/>
               </w:sdtContent>
             </w:sdt>
             <w:r>
@@ -470,6 +455,9 @@
         <w:tabs>
           <w:tab w:val="left" w:pos="1608"/>
         </w:tabs>
+        <w:rPr>
+          <w:lang w:val="en-IN"/>
+        </w:rPr>
       </w:pPr>
     </w:p>
     <w:p>
@@ -491,20 +479,348 @@
     <w:tbl>
       <w:tblPr>
         <w:tblStyle w:val="TableGrid"/>
-        <w:tblW w:w="0" w:type="auto"/>
+        <w:tblW w:w="10206" w:type="dxa"/>
+        <w:tblInd w:w="-5" w:type="dxa"/>
+        <w:tblLayout w:type="fixed"/>
         <w:tblLook w:val="04A0" w:firstRow="1" w:lastRow="0" w:firstColumn="1" w:lastColumn="0" w:noHBand="0" w:noVBand="1"/>
       </w:tblPr>
       <w:tblGrid>
-        <w:gridCol w:w="1152"/>
-        <w:gridCol w:w="2172"/>
-        <w:gridCol w:w="1493"/>
-        <w:gridCol w:w="1940"/>
-        <w:gridCol w:w="2871"/>
+        <w:gridCol w:w="1612"/>
+        <w:gridCol w:w="4194"/>
+        <w:gridCol w:w="1246"/>
+        <w:gridCol w:w="1312"/>
+        <w:gridCol w:w="1842"/>
       </w:tblGrid>
       <w:tr>
+        <w:trPr>
+          <w:trHeight w:val="132"/>
+        </w:trPr>
         <w:tc>
           <w:tcPr>
-            <w:tcW w:w="1164" w:type="dxa"/>
+            <w:tcW w:w="1612" w:type="dxa"/>
+          </w:tcPr>
+          <w:p>
+            <w:pPr>
+              <w:tabs>
+                <w:tab w:val="left" w:pos="1608"/>
+              </w:tabs>
+              <w:jc w:val="center"/>
+              <w:rPr>
+                <w:b/>
+                <w:bCs/>
+              </w:rPr>
+            </w:pPr>
+            <w:r>
+              <w:rPr>
+                <w:b/>
+                <w:bCs/>
+              </w:rPr>
+              <w:t>Serial Number</w:t>
+            </w:r>
+          </w:p>
+        </w:tc>
+        <w:tc>
+          <w:tcPr>
+            <w:tcW w:w="4194" w:type="dxa"/>
+          </w:tcPr>
+          <w:p>
+            <w:pPr>
+              <w:tabs>
+                <w:tab w:val="left" w:pos="1608"/>
+              </w:tabs>
+              <w:jc w:val="center"/>
+              <w:rPr>
+                <w:b/>
+                <w:bCs/>
+              </w:rPr>
+            </w:pPr>
+            <w:r>
+              <w:rPr>
+                <w:b/>
+                <w:bCs/>
+              </w:rPr>
+              <w:t>Item Description</w:t>
+            </w:r>
+          </w:p>
+        </w:tc>
+        <w:tc>
+          <w:tcPr>
+            <w:tcW w:w="1246" w:type="dxa"/>
+          </w:tcPr>
+          <w:p>
+            <w:pPr>
+              <w:tabs>
+                <w:tab w:val="left" w:pos="1608"/>
+              </w:tabs>
+              <w:jc w:val="center"/>
+              <w:rPr>
+                <w:b/>
+                <w:bCs/>
+              </w:rPr>
+            </w:pPr>
+            <w:r>
+              <w:rPr>
+                <w:b/>
+                <w:bCs/>
+              </w:rPr>
+              <w:t>Amount</w:t>
+            </w:r>
+          </w:p>
+        </w:tc>
+        <w:tc>
+          <w:tcPr>
+            <w:tcW w:w="1312" w:type="dxa"/>
+          </w:tcPr>
+          <w:p>
+            <w:pPr>
+              <w:tabs>
+                <w:tab w:val="left" w:pos="1608"/>
+              </w:tabs>
+              <w:jc w:val="center"/>
+              <w:rPr>
+                <w:b/>
+                <w:bCs/>
+              </w:rPr>
+            </w:pPr>
+            <w:r>
+              <w:rPr>
+                <w:b/>
+                <w:bCs/>
+              </w:rPr>
+              <w:t>Tax</w:t>
+            </w:r>
+          </w:p>
+        </w:tc>
+        <w:tc>
+          <w:tcPr>
+            <w:tcW w:w="1842" w:type="dxa"/>
+          </w:tcPr>
+          <w:p>
+            <w:pPr>
+              <w:tabs>
+                <w:tab w:val="left" w:pos="1608"/>
+              </w:tabs>
+              <w:jc w:val="center"/>
+              <w:rPr>
+                <w:b/>
+                <w:bCs/>
+              </w:rPr>
+            </w:pPr>
+            <w:r>
+              <w:rPr>
+                <w:b/>
+                <w:bCs/>
+              </w:rPr>
+              <w:t>Amount Incl.Tax</w:t>
+            </w:r>
+          </w:p>
+        </w:tc>
+      </w:tr>
+      <w:tr>
+        <w:trPr>
+          <w:trHeight w:val="132"/>
+        </w:trPr>
+        <w:sdt>
+          <w:sdtPr>
+            <w:alias w:val="#Nav: /TenancyContractSubpage/Entry_No_"/>
+            <w:tag w:val="#Nav: Other_Payment_Details/50110"/>
+            <w:id w:val="-31191941"/>
+            <w:placeholder>
+              <w:docPart w:val="26FC1B68233B497A8C84870F9178AFE7"/>
+            </w:placeholder>
+            <w:dataBinding w:prefixMappings="xmlns:ns0='urn:microsoft-dynamics-nav/reports/Other_Payment_Details/50110/'" w:xpath="/ns0:NavWordReportXmlPart[1]/ns0:TenancyContractSubpage[1]/ns0:Entry_No_[1]" w:storeItemID="{1B288537-E1B4-496E-895B-159FCB78FD89}"/>
+            <w:text/>
+          </w:sdtPr>
+          <w:sdtContent>
+            <w:tc>
+              <w:tcPr>
+                <w:tcW w:w="1612" w:type="dxa"/>
+                <w:tcBorders>
+                  <w:bottom w:val="single" w:color="auto" w:sz="4" w:space="0"/>
+                </w:tcBorders>
+              </w:tcPr>
+              <w:p>
+                <w:pPr>
+                  <w:tabs>
+                    <w:tab w:val="left" w:pos="1608"/>
+                  </w:tabs>
+                  <w:jc w:val="center"/>
+                  <w:rPr>
+                    <w:b/>
+                    <w:bCs/>
+                  </w:rPr>
+                </w:pPr>
+                <w:r>
+                  <w:t>Entry_No_</w:t>
+                </w:r>
+              </w:p>
+            </w:tc>
+          </w:sdtContent>
+        </w:sdt>
+        <w:tc>
+          <w:tcPr>
+            <w:tcW w:w="4194" w:type="dxa"/>
+            <w:tcBorders>
+              <w:bottom w:val="single" w:color="auto" w:sz="4" w:space="0"/>
+            </w:tcBorders>
+          </w:tcPr>
+          <w:p>
+            <w:pPr>
+              <w:tabs>
+                <w:tab w:val="left" w:pos="1608"/>
+              </w:tabs>
+            </w:pPr>
+            <w:r>
+              <w:t>Rent</w:t>
+            </w:r>
+          </w:p>
+        </w:tc>
+        <w:sdt>
+          <w:sdtPr>
+            <w:alias w:val="#Nav: /Lease_Proposal_Details/Annual_R_A"/>
+            <w:tag w:val="#Nav: Other_Payment_Details/50110"/>
+            <w:id w:val="-1342697779"/>
+            <w:placeholder>
+              <w:docPart w:val="DefaultPlaceholder_-1854013440"/>
+            </w:placeholder>
+            <w:dataBinding w:prefixMappings="xmlns:ns0='urn:microsoft-dynamics-nav/reports/Other_Payment_Details/50110/'" w:xpath="/ns0:NavWordReportXmlPart[1]/ns0:Lease_Proposal_Details[1]/ns0:Annual_R_A[1]" w:storeItemID="{1B288537-E1B4-496E-895B-159FCB78FD89}"/>
+            <w:text/>
+          </w:sdtPr>
+          <w:sdtContent>
+            <w:tc>
+              <w:tcPr>
+                <w:tcW w:w="1246" w:type="dxa"/>
+                <w:tcBorders>
+                  <w:bottom w:val="single" w:color="auto" w:sz="4" w:space="0"/>
+                </w:tcBorders>
+              </w:tcPr>
+              <w:p>
+                <w:pPr>
+                  <w:tabs>
+                    <w:tab w:val="left" w:pos="1608"/>
+                  </w:tabs>
+                  <w:jc w:val="right"/>
+                  <w:rPr>
+                    <w:b/>
+                    <w:bCs/>
+                  </w:rPr>
+                </w:pPr>
+                <w:r>
+                  <w:t>Annual_R_A</w:t>
+                </w:r>
+              </w:p>
+            </w:tc>
+          </w:sdtContent>
+        </w:sdt>
+        <w:sdt>
+          <w:sdtPr>
+            <w:alias w:val="#Nav: /Lease_Proposal_Details/Rent_VAT_A"/>
+            <w:tag w:val="#Nav: Other_Payment_Details/50110"/>
+            <w:id w:val="-1425336140"/>
+            <w:placeholder>
+              <w:docPart w:val="DefaultPlaceholder_-1854013440"/>
+            </w:placeholder>
+            <w:dataBinding w:prefixMappings="xmlns:ns0='urn:microsoft-dynamics-nav/reports/Other_Payment_Details/50110/'" w:xpath="/ns0:NavWordReportXmlPart[1]/ns0:Lease_Proposal_Details[1]/ns0:Rent_VAT_A[1]" w:storeItemID="{1B288537-E1B4-496E-895B-159FCB78FD89}"/>
+            <w:text/>
+          </w:sdtPr>
+          <w:sdtContent>
+            <w:tc>
+              <w:tcPr>
+                <w:tcW w:w="1312" w:type="dxa"/>
+                <w:tcBorders>
+                  <w:bottom w:val="single" w:color="auto" w:sz="4" w:space="0"/>
+                </w:tcBorders>
+              </w:tcPr>
+              <w:p>
+                <w:pPr>
+                  <w:tabs>
+                    <w:tab w:val="left" w:pos="1608"/>
+                  </w:tabs>
+                  <w:jc w:val="right"/>
+                  <w:rPr>
+                    <w:b/>
+                    <w:bCs/>
+                  </w:rPr>
+                </w:pPr>
+                <w:r>
+                  <w:t>Rent_VAT_A</w:t>
+                </w:r>
+              </w:p>
+            </w:tc>
+          </w:sdtContent>
+        </w:sdt>
+        <w:sdt>
+          <w:sdtPr>
+            <w:alias w:val="#Nav: /Lease_Proposal_Details/Rent_A_Incl_VAT"/>
+            <w:tag w:val="#Nav: Other_Payment_Details/50110"/>
+            <w:id w:val="67542500"/>
+            <w:placeholder>
+              <w:docPart w:val="DefaultPlaceholder_-1854013440"/>
+            </w:placeholder>
+            <w:dataBinding w:prefixMappings="xmlns:ns0='urn:microsoft-dynamics-nav/reports/Other_Payment_Details/50110/'" w:xpath="/ns0:NavWordReportXmlPart[1]/ns0:Lease_Proposal_Details[1]/ns0:Rent_A_Incl_VAT[1]" w:storeItemID="{1B288537-E1B4-496E-895B-159FCB78FD89}"/>
+            <w:text/>
+          </w:sdtPr>
+          <w:sdtContent>
+            <w:tc>
+              <w:tcPr>
+                <w:tcW w:w="1842" w:type="dxa"/>
+                <w:tcBorders>
+                  <w:bottom w:val="single" w:color="auto" w:sz="4" w:space="0"/>
+                </w:tcBorders>
+              </w:tcPr>
+              <w:p>
+                <w:pPr>
+                  <w:tabs>
+                    <w:tab w:val="left" w:pos="1608"/>
+                  </w:tabs>
+                  <w:jc w:val="right"/>
+                  <w:rPr>
+                    <w:b/>
+                    <w:bCs/>
+                  </w:rPr>
+                </w:pPr>
+                <w:r>
+                  <w:t>Rent_A_Incl_VAT</w:t>
+                </w:r>
+              </w:p>
+            </w:tc>
+          </w:sdtContent>
+        </w:sdt>
+      </w:tr>
+      <w:tr>
+        <w:trPr>
+          <w:trHeight w:val="132"/>
+        </w:trPr>
+        <w:tc>
+          <w:tcPr>
+            <w:tcW w:w="10206" w:type="dxa"/>
+            <w:gridSpan w:val="5"/>
+            <w:tcBorders>
+              <w:top w:val="single" w:color="auto" w:sz="4" w:space="0"/>
+              <w:left w:val="nil"/>
+              <w:right w:val="nil"/>
+            </w:tcBorders>
+          </w:tcPr>
+          <w:p>
+            <w:pPr>
+              <w:tabs>
+                <w:tab w:val="left" w:pos="1608"/>
+              </w:tabs>
+              <w:rPr>
+                <w:b/>
+                <w:bCs/>
+              </w:rPr>
+            </w:pPr>
+          </w:p>
+        </w:tc>
+      </w:tr>
+      <w:tr>
+        <w:trPr>
+          <w:trHeight w:val="132"/>
+        </w:trPr>
+        <w:tc>
+          <w:tcPr>
+            <w:tcW w:w="1612" w:type="dxa"/>
           </w:tcPr>
           <w:p>
             <w:pPr>
@@ -524,7 +840,7 @@
         </w:tc>
         <w:tc>
           <w:tcPr>
-            <w:tcW w:w="1950" w:type="dxa"/>
+            <w:tcW w:w="4194" w:type="dxa"/>
           </w:tcPr>
           <w:p>
             <w:pPr>
@@ -544,7 +860,7 @@
         </w:tc>
         <w:tc>
           <w:tcPr>
-            <w:tcW w:w="1757" w:type="dxa"/>
+            <w:tcW w:w="1246" w:type="dxa"/>
           </w:tcPr>
           <w:p>
             <w:pPr>
@@ -564,7 +880,7 @@
         </w:tc>
         <w:tc>
           <w:tcPr>
-            <w:tcW w:w="1917" w:type="dxa"/>
+            <w:tcW w:w="1312" w:type="dxa"/>
           </w:tcPr>
           <w:p>
             <w:pPr>
@@ -584,7 +900,7 @@
         </w:tc>
         <w:tc>
           <w:tcPr>
-            <w:tcW w:w="2840" w:type="dxa"/>
+            <w:tcW w:w="1842" w:type="dxa"/>
           </w:tcPr>
           <w:p>
             <w:pPr>
@@ -598,17 +914,8 @@
                 <w:b/>
                 <w:bCs/>
               </w:rPr>
-              <w:t xml:space="preserve">Amount </w:t>
+              <w:t>Amount Incl.Tax</w:t>
             </w:r>
-            <w:proofErr w:type="spellStart"/>
-            <w:r>
-              <w:rPr>
-                <w:b/>
-                <w:bCs/>
-              </w:rPr>
-              <w:t>Incl.Tax</w:t>
-            </w:r>
-            <w:proofErr w:type="spellEnd"/>
           </w:p>
         </w:tc>
       </w:tr>
@@ -616,14 +923,14 @@
         <w:sdtPr>
           <w:alias w:val="#Nav: /TenancyContractSubpage"/>
           <w:tag w:val="#Nav: Other_Payment_Details/50110"/>
-          <w:id w:val="872270983"/>
+          <w:id w:val="-410616414"/>
           <w15:dataBinding w:prefixMappings="xmlns:ns0='urn:microsoft-dynamics-nav/reports/Other_Payment_Details/50110/'" w:xpath="/ns0:NavWordReportXmlPart[1]/ns0:TenancyContractSubpage" w:storeItemID="{1B288537-E1B4-496E-895B-159FCB78FD89}"/>
           <w15:repeatingSection/>
         </w:sdtPr>
         <w:sdtContent>
           <w:sdt>
             <w:sdtPr>
-              <w:id w:val="-608508632"/>
+              <w:id w:val="-1776861727"/>
               <w:placeholder>
                 <w:docPart w:val="DefaultPlaceholder_-1854013435"/>
               </w:placeholder>
@@ -631,11 +938,14 @@
             </w:sdtPr>
             <w:sdtContent>
               <w:tr>
+                <w:trPr>
+                  <w:trHeight w:val="132"/>
+                </w:trPr>
                 <w:sdt>
                   <w:sdtPr>
                     <w:alias w:val="#Nav: /TenancyContractSubpage/Entry_No_"/>
                     <w:tag w:val="#Nav: Other_Payment_Details/50110"/>
-                    <w:id w:val="65382610"/>
+                    <w:id w:val="-788509639"/>
                     <w:placeholder>
                       <w:docPart w:val="DefaultPlaceholder_-1854013440"/>
                     </w:placeholder>
@@ -645,19 +955,14 @@
                   <w:sdtContent>
                     <w:tc>
                       <w:tcPr>
-                        <w:tcW w:w="1164" w:type="dxa"/>
+                        <w:tcW w:w="1612" w:type="dxa"/>
                       </w:tcPr>
                       <w:p>
                         <w:pPr>
                           <w:jc w:val="center"/>
                         </w:pPr>
-                        <w:proofErr w:type="spellStart"/>
                         <w:r>
-                          <w:t>Entry_No</w:t>
-                        </w:r>
-                        <w:proofErr w:type="spellEnd"/>
-                        <w:r>
-                          <w:t>_</w:t>
+                          <w:t>Entry_No_</w:t>
                         </w:r>
                       </w:p>
                     </w:tc>
@@ -667,7 +972,7 @@
                   <w:sdtPr>
                     <w:alias w:val="#Nav: /TenancyContractSubpage/Secondary_Item_Type"/>
                     <w:tag w:val="#Nav: Other_Payment_Details/50110"/>
-                    <w:id w:val="-498885815"/>
+                    <w:id w:val="-851567651"/>
                     <w:placeholder>
                       <w:docPart w:val="DefaultPlaceholder_-1854013440"/>
                     </w:placeholder>
@@ -677,14 +982,12 @@
                   <w:sdtContent>
                     <w:tc>
                       <w:tcPr>
-                        <w:tcW w:w="1950" w:type="dxa"/>
+                        <w:tcW w:w="4194" w:type="dxa"/>
                       </w:tcPr>
                       <w:p>
-                        <w:proofErr w:type="spellStart"/>
                         <w:r>
                           <w:t>Secondary_Item_Type</w:t>
                         </w:r>
-                        <w:proofErr w:type="spellEnd"/>
                       </w:p>
                     </w:tc>
                   </w:sdtContent>
@@ -693,7 +996,7 @@
                   <w:sdtPr>
                     <w:alias w:val="#Nav: /TenancyContractSubpage/Amount"/>
                     <w:tag w:val="#Nav: Other_Payment_Details/50110"/>
-                    <w:id w:val="-2033247776"/>
+                    <w:id w:val="-1059481061"/>
                     <w:placeholder>
                       <w:docPart w:val="DefaultPlaceholder_-1854013440"/>
                     </w:placeholder>
@@ -703,12 +1006,9 @@
                   <w:sdtContent>
                     <w:tc>
                       <w:tcPr>
-                        <w:tcW w:w="1757" w:type="dxa"/>
+                        <w:tcW w:w="1246" w:type="dxa"/>
                       </w:tcPr>
                       <w:p>
-                        <w:pPr>
-                          <w:jc w:val="right"/>
-                        </w:pPr>
                         <w:r>
                           <w:t>Amount</w:t>
                         </w:r>
@@ -720,7 +1020,7 @@
                   <w:sdtPr>
                     <w:alias w:val="#Nav: /TenancyContractSubpage/VAT_Amount"/>
                     <w:tag w:val="#Nav: Other_Payment_Details/50110"/>
-                    <w:id w:val="-283733388"/>
+                    <w:id w:val="244434"/>
                     <w:placeholder>
                       <w:docPart w:val="DefaultPlaceholder_-1854013440"/>
                     </w:placeholder>
@@ -730,17 +1030,12 @@
                   <w:sdtContent>
                     <w:tc>
                       <w:tcPr>
-                        <w:tcW w:w="1917" w:type="dxa"/>
+                        <w:tcW w:w="1312" w:type="dxa"/>
                       </w:tcPr>
                       <w:p>
-                        <w:pPr>
-                          <w:jc w:val="right"/>
-                        </w:pPr>
-                        <w:proofErr w:type="spellStart"/>
                         <w:r>
                           <w:t>VAT_Amount</w:t>
                         </w:r>
-                        <w:proofErr w:type="spellEnd"/>
                       </w:p>
                     </w:tc>
                   </w:sdtContent>
@@ -749,7 +1044,7 @@
                   <w:sdtPr>
                     <w:alias w:val="#Nav: /TenancyContractSubpage/Amount_Including_VAT"/>
                     <w:tag w:val="#Nav: Other_Payment_Details/50110"/>
-                    <w:id w:val="-727916730"/>
+                    <w:id w:val="-906768036"/>
                     <w:placeholder>
                       <w:docPart w:val="DefaultPlaceholder_-1854013440"/>
                     </w:placeholder>
@@ -759,17 +1054,12 @@
                   <w:sdtContent>
                     <w:tc>
                       <w:tcPr>
-                        <w:tcW w:w="2840" w:type="dxa"/>
+                        <w:tcW w:w="1842" w:type="dxa"/>
                       </w:tcPr>
                       <w:p>
-                        <w:pPr>
-                          <w:jc w:val="right"/>
-                        </w:pPr>
-                        <w:proofErr w:type="spellStart"/>
                         <w:r>
                           <w:t>Amount_Including_VAT</w:t>
                         </w:r>
-                        <w:proofErr w:type="spellEnd"/>
                       </w:p>
                     </w:tc>
                   </w:sdtContent>
@@ -780,9 +1070,12 @@
         </w:sdtContent>
       </w:sdt>
       <w:tr>
+        <w:trPr>
+          <w:trHeight w:val="132"/>
+        </w:trPr>
         <w:tc>
           <w:tcPr>
-            <w:tcW w:w="1164" w:type="dxa"/>
+            <w:tcW w:w="1612" w:type="dxa"/>
           </w:tcPr>
           <w:p>
             <w:pPr>
@@ -794,7 +1087,7 @@
         </w:tc>
         <w:tc>
           <w:tcPr>
-            <w:tcW w:w="1950" w:type="dxa"/>
+            <w:tcW w:w="4194" w:type="dxa"/>
           </w:tcPr>
           <w:p>
             <w:pPr>
@@ -819,7 +1112,7 @@
             </w:rPr>
             <w:alias w:val="#Nav: /TotalSection/Total_Amount"/>
             <w:tag w:val="#Nav: Other_Payment_Details/50110"/>
-            <w:id w:val="87434873"/>
+            <w:id w:val="673930207"/>
             <w:placeholder>
               <w:docPart w:val="DefaultPlaceholder_-1854013440"/>
             </w:placeholder>
@@ -829,7 +1122,7 @@
           <w:sdtContent>
             <w:tc>
               <w:tcPr>
-                <w:tcW w:w="1757" w:type="dxa"/>
+                <w:tcW w:w="1246" w:type="dxa"/>
               </w:tcPr>
               <w:p>
                 <w:pPr>
@@ -838,7 +1131,6 @@
                   </w:tabs>
                   <w:jc w:val="right"/>
                 </w:pPr>
-                <w:proofErr w:type="spellStart"/>
                 <w:r>
                   <w:rPr>
                     <w:b/>
@@ -846,7 +1138,6 @@
                   </w:rPr>
                   <w:t>Total_Amount</w:t>
                 </w:r>
-                <w:proofErr w:type="spellEnd"/>
               </w:p>
             </w:tc>
           </w:sdtContent>
@@ -859,7 +1150,7 @@
             </w:rPr>
             <w:alias w:val="#Nav: /TotalSection/Total_VAT_Amount"/>
             <w:tag w:val="#Nav: Other_Payment_Details/50110"/>
-            <w:id w:val="-528108188"/>
+            <w:id w:val="-497650610"/>
             <w:placeholder>
               <w:docPart w:val="DefaultPlaceholder_-1854013440"/>
             </w:placeholder>
@@ -869,7 +1160,7 @@
           <w:sdtContent>
             <w:tc>
               <w:tcPr>
-                <w:tcW w:w="1917" w:type="dxa"/>
+                <w:tcW w:w="1312" w:type="dxa"/>
               </w:tcPr>
               <w:p>
                 <w:pPr>
@@ -878,7 +1169,6 @@
                   </w:tabs>
                   <w:jc w:val="right"/>
                 </w:pPr>
-                <w:proofErr w:type="spellStart"/>
                 <w:r>
                   <w:rPr>
                     <w:b/>
@@ -886,7 +1176,6 @@
                   </w:rPr>
                   <w:t>Total_VAT_Amount</w:t>
                 </w:r>
-                <w:proofErr w:type="spellEnd"/>
               </w:p>
             </w:tc>
           </w:sdtContent>
@@ -899,7 +1188,7 @@
             </w:rPr>
             <w:alias w:val="#Nav: /TotalSection/Total_Amount_Including_VAT"/>
             <w:tag w:val="#Nav: Other_Payment_Details/50110"/>
-            <w:id w:val="-1061711889"/>
+            <w:id w:val="-583522158"/>
             <w:placeholder>
               <w:docPart w:val="DefaultPlaceholder_-1854013440"/>
             </w:placeholder>
@@ -909,7 +1198,7 @@
           <w:sdtContent>
             <w:tc>
               <w:tcPr>
-                <w:tcW w:w="2840" w:type="dxa"/>
+                <w:tcW w:w="1842" w:type="dxa"/>
               </w:tcPr>
               <w:p>
                 <w:pPr>
@@ -918,7 +1207,6 @@
                   </w:tabs>
                   <w:jc w:val="right"/>
                 </w:pPr>
-                <w:proofErr w:type="spellStart"/>
                 <w:r>
                   <w:rPr>
                     <w:b/>
@@ -926,7 +1214,6 @@
                   </w:rPr>
                   <w:t>Total_Amount_Including_VAT</w:t>
                 </w:r>
-                <w:proofErr w:type="spellEnd"/>
               </w:p>
             </w:tc>
           </w:sdtContent>
@@ -938,19 +1225,20 @@
         <w:tabs>
           <w:tab w:val="left" w:pos="1608"/>
         </w:tabs>
-      </w:pPr>
-    </w:p>
-    <w:p>
-      <w:pPr>
-        <w:tabs>
-          <w:tab w:val="left" w:pos="1608"/>
-        </w:tabs>
         <w:rPr>
           <w:b/>
           <w:bCs/>
           <w:lang w:val="en-IN"/>
         </w:rPr>
       </w:pPr>
+      <w:r>
+        <w:rPr>
+          <w:b/>
+          <w:bCs/>
+          <w:lang w:val="en-IN"/>
+        </w:rPr>
+        <w:br/>
+      </w:r>
       <w:r>
         <w:rPr>
           <w:b/>
@@ -1008,7 +1296,6 @@
               <w:lang w:val="en-IN"/>
             </w:rPr>
           </w:pPr>
-          <w:proofErr w:type="spellStart"/>
           <w:r>
             <w:rPr>
               <w:b/>
@@ -1017,7 +1304,6 @@
             </w:rPr>
             <w:t>CompanyName</w:t>
           </w:r>
-          <w:proofErr w:type="spellEnd"/>
         </w:p>
       </w:sdtContent>
     </w:sdt>
@@ -1147,9 +1433,9 @@
             <w:noProof/>
           </w:rPr>
           <w:drawing>
-            <wp:inline distT="0" distB="0" distL="0" distR="0" wp14:anchorId="5FE11997" wp14:editId="764F28B5">
-              <wp:extent cx="2659380" cy="952500"/>
-              <wp:effectExtent l="0" t="0" r="7620" b="0"/>
+            <wp:inline distT="0" distB="0" distL="0" distR="0" wp14:anchorId="5FE11997" wp14:editId="08484F5E">
+              <wp:extent cx="2537460" cy="952500"/>
+              <wp:effectExtent l="0" t="0" r="0" b="0"/>
               <wp:docPr id="1" name="Picture 1"/>
               <wp:cNvGraphicFramePr>
                 <a:graphicFrameLocks xmlns:a="http://schemas.openxmlformats.org/drawingml/2006/main" noChangeAspect="1"/>
@@ -1172,7 +1458,7 @@
                     <pic:spPr bwMode="auto">
                       <a:xfrm>
                         <a:off x="0" y="0"/>
-                        <a:ext cx="2659380" cy="952500"/>
+                        <a:ext cx="2537460" cy="952500"/>
                       </a:xfrm>
                       <a:prstGeom prst="rect">
                         <a:avLst/>
@@ -1763,6 +2049,35 @@
         </w:p>
       </w:docPartBody>
     </w:docPart>
+    <w:docPart>
+      <w:docPartPr>
+        <w:name w:val="26FC1B68233B497A8C84870F9178AFE7"/>
+        <w:category>
+          <w:name w:val="General"/>
+          <w:gallery w:val="placeholder"/>
+        </w:category>
+        <w:types>
+          <w:type w:val="bbPlcHdr"/>
+        </w:types>
+        <w:behaviors>
+          <w:behavior w:val="content"/>
+        </w:behaviors>
+        <w:guid w:val="{D3DEAF33-D3A1-49EF-A7F1-503BE85DAA04}"/>
+      </w:docPartPr>
+      <w:docPartBody>
+        <w:p>
+          <w:pPr>
+            <w:pStyle w:val="26FC1B68233B497A8C84870F9178AFE7"/>
+          </w:pPr>
+          <w:r>
+            <w:rPr>
+              <w:rStyle w:val="PlaceholderText"/>
+            </w:rPr>
+            <w:t>Click or tap here to enter text.</w:t>
+          </w:r>
+        </w:p>
+      </w:docPartBody>
+    </w:docPart>
   </w:docParts>
 </w:glossaryDocument>
 </file>
@@ -1811,29 +2126,53 @@
     <w:rsidRoot w:val="004E3FEC"/>
     <w:rsid w:val="00025143"/>
     <w:rsid w:val="00097762"/>
+    <w:rsid w:val="0009786F"/>
+    <w:rsid w:val="000A3247"/>
+    <w:rsid w:val="00130A1D"/>
+    <w:rsid w:val="001526BF"/>
+    <w:rsid w:val="001B6819"/>
+    <w:rsid w:val="001E6FAA"/>
+    <w:rsid w:val="00245937"/>
+    <w:rsid w:val="002F70B9"/>
+    <w:rsid w:val="003719A6"/>
     <w:rsid w:val="003C13F7"/>
+    <w:rsid w:val="003D1928"/>
     <w:rsid w:val="004E3FEC"/>
+    <w:rsid w:val="00547C8D"/>
     <w:rsid w:val="00552E37"/>
+    <w:rsid w:val="00584065"/>
+    <w:rsid w:val="00584BAB"/>
     <w:rsid w:val="005B4FFF"/>
     <w:rsid w:val="005E5403"/>
     <w:rsid w:val="006527E8"/>
+    <w:rsid w:val="006729E4"/>
     <w:rsid w:val="0067588D"/>
     <w:rsid w:val="0069502E"/>
+    <w:rsid w:val="00731B61"/>
     <w:rsid w:val="007F4367"/>
     <w:rsid w:val="00863365"/>
+    <w:rsid w:val="00904363"/>
     <w:rsid w:val="009157CD"/>
     <w:rsid w:val="00931A1D"/>
     <w:rsid w:val="009820F3"/>
+    <w:rsid w:val="00995CCE"/>
     <w:rsid w:val="00A57165"/>
     <w:rsid w:val="00A81EAB"/>
     <w:rsid w:val="00A823FB"/>
     <w:rsid w:val="00B240B5"/>
+    <w:rsid w:val="00B619E8"/>
+    <w:rsid w:val="00B8761E"/>
+    <w:rsid w:val="00B92E21"/>
     <w:rsid w:val="00BB2A2D"/>
+    <w:rsid w:val="00C103B6"/>
+    <w:rsid w:val="00C377F5"/>
+    <w:rsid w:val="00C70B89"/>
     <w:rsid w:val="00D44715"/>
     <w:rsid w:val="00E20637"/>
     <w:rsid w:val="00E57C7D"/>
     <w:rsid w:val="00E67BDC"/>
     <w:rsid w:val="00EC2B1C"/>
+    <w:rsid w:val="00F0188B"/>
   </w:rsids>
   <m:mathPr>
     <m:mathFont m:val="Cambria Math"/>
@@ -2289,10 +2628,14 @@
     <w:basedOn w:val="DefaultParagraphFont"/>
     <w:uiPriority w:val="99"/>
     <w:semiHidden/>
-    <w:rsid w:val="004E3FEC"/>
+    <w:rsid w:val="00C377F5"/>
     <w:rPr>
       <w:color w:val="666666"/>
     </w:rPr>
+  </w:style>
+  <w:style w:type="paragraph" w:customStyle="1" w:styleId="26FC1B68233B497A8C84870F9178AFE7">
+    <w:name w:val="26FC1B68233B497A8C84870F9178AFE7"/>
+    <w:rsid w:val="00C377F5"/>
   </w:style>
 </w:styles>
 </file>
@@ -2645,6 +2988,20 @@
  
      < / T o t a l S e c t i o n >   
+     < L e a s e _ P r o p o s a l _ D e t a i l s > + 
+         < A n n u a l _ R _ A > A n n u a l _ R _ A < / A n n u a l _ R _ A > + 
+         < I D > I D < / I D > + 
+         < R e n t _ A m o u n t > R e n t _ A m o u n t < / R e n t _ A m o u n t > + 
+         < R e n t _ A _ I n c l _ V A T > R e n t _ A _ I n c l _ V A T < / R e n t _ A _ I n c l _ V A T > + 
+         < R e n t _ V A T _ A > R e n t _ V A T _ A < / R e n t _ V A T _ A > + 
+     < / L e a s e _ P r o p o s a l _ D e t a i l s > + 
  < / N a v W o r d R e p o r t X m l P a r t > 
 </file>
 

</xml_diff>

<commit_message>
other payment report changes
</commit_message>
<xml_diff>
--- a/OtherPaymentDetails.docx
+++ b/OtherPaymentDetails.docx
@@ -1,6 +1,6 @@
 
 <file path=word/document.xml><?xml version="1.0" encoding="utf-8"?>
-<w:document xmlns:wpc="http://schemas.microsoft.com/office/word/2010/wordprocessingCanvas" xmlns:cx="http://schemas.microsoft.com/office/drawing/2014/chartex" xmlns:cx1="http://schemas.microsoft.com/office/drawing/2015/9/8/chartex" xmlns:cx2="http://schemas.microsoft.com/office/drawing/2015/10/21/chartex" xmlns:cx3="http://schemas.microsoft.com/office/drawing/2016/5/9/chartex" xmlns:cx4="http://schemas.microsoft.com/office/drawing/2016/5/10/chartex" xmlns:cx5="http://schemas.microsoft.com/office/drawing/2016/5/11/chartex" xmlns:cx6="http://schemas.microsoft.com/office/drawing/2016/5/12/chartex" xmlns:cx7="http://schemas.microsoft.com/office/drawing/2016/5/13/chartex" xmlns:cx8="http://schemas.microsoft.com/office/drawing/2016/5/14/chartex" xmlns:mc="http://schemas.openxmlformats.org/markup-compatibility/2006" xmlns:aink="http://schemas.microsoft.com/office/drawing/2016/ink" xmlns:am3d="http://schemas.microsoft.com/office/drawing/2017/model3d" xmlns:o="urn:schemas-microsoft-com:office:office" xmlns:oel="http://schemas.microsoft.com/office/2019/extlst" xmlns:r="http://schemas.openxmlformats.org/officeDocument/2006/relationships" xmlns:m="http://schemas.openxmlformats.org/officeDocument/2006/math" xmlns:v="urn:schemas-microsoft-com:vml" xmlns:wp14="http://schemas.microsoft.com/office/word/2010/wordprocessingDrawing" xmlns:wp="http://schemas.openxmlformats.org/drawingml/2006/wordprocessingDrawing" xmlns:w10="urn:schemas-microsoft-com:office:word" xmlns:w="http://schemas.openxmlformats.org/wordprocessingml/2006/main" xmlns:w14="http://schemas.microsoft.com/office/word/2010/wordml" xmlns:w15="http://schemas.microsoft.com/office/word/2012/wordml" xmlns:w16cex="http://schemas.microsoft.com/office/word/2018/wordml/cex" xmlns:w16cid="http://schemas.microsoft.com/office/word/2016/wordml/cid" xmlns:w16="http://schemas.microsoft.com/office/word/2018/wordml" xmlns:w16du="http://schemas.microsoft.com/office/word/2023/wordml/word16du" xmlns:w16sdtdh="http://schemas.microsoft.com/office/word/2020/wordml/sdtdatahash" xmlns:w16se="http://schemas.microsoft.com/office/word/2015/wordml/symex" xmlns:wpg="http://schemas.microsoft.com/office/word/2010/wordprocessingGroup" xmlns:wpi="http://schemas.microsoft.com/office/word/2010/wordprocessingInk" xmlns:wne="http://schemas.microsoft.com/office/word/2006/wordml" xmlns:wps="http://schemas.microsoft.com/office/word/2010/wordprocessingShape" mc:Ignorable="w14 w15 w16se w16cid w16 w16cex w16sdtdh w16du wp14">
+<w:document xmlns:wpc="http://schemas.microsoft.com/office/word/2010/wordprocessingCanvas" xmlns:cx="http://schemas.microsoft.com/office/drawing/2014/chartex" xmlns:cx1="http://schemas.microsoft.com/office/drawing/2015/9/8/chartex" xmlns:cx2="http://schemas.microsoft.com/office/drawing/2015/10/21/chartex" xmlns:cx3="http://schemas.microsoft.com/office/drawing/2016/5/9/chartex" xmlns:cx4="http://schemas.microsoft.com/office/drawing/2016/5/10/chartex" xmlns:cx5="http://schemas.microsoft.com/office/drawing/2016/5/11/chartex" xmlns:cx6="http://schemas.microsoft.com/office/drawing/2016/5/12/chartex" xmlns:cx7="http://schemas.microsoft.com/office/drawing/2016/5/13/chartex" xmlns:cx8="http://schemas.microsoft.com/office/drawing/2016/5/14/chartex" xmlns:mc="http://schemas.openxmlformats.org/markup-compatibility/2006" xmlns:aink="http://schemas.microsoft.com/office/drawing/2016/ink" xmlns:am3d="http://schemas.microsoft.com/office/drawing/2017/model3d" xmlns:o="urn:schemas-microsoft-com:office:office" xmlns:oel="http://schemas.microsoft.com/office/2019/extlst" xmlns:r="http://schemas.openxmlformats.org/officeDocument/2006/relationships" xmlns:m="http://schemas.openxmlformats.org/officeDocument/2006/math" xmlns:v="urn:schemas-microsoft-com:vml" xmlns:wp14="http://schemas.microsoft.com/office/word/2010/wordprocessingDrawing" xmlns:wp="http://schemas.openxmlformats.org/drawingml/2006/wordprocessingDrawing" xmlns:w10="urn:schemas-microsoft-com:office:word" xmlns:w="http://schemas.openxmlformats.org/wordprocessingml/2006/main" xmlns:w14="http://schemas.microsoft.com/office/word/2010/wordml" xmlns:w15="http://schemas.microsoft.com/office/word/2012/wordml" xmlns:w16cex="http://schemas.microsoft.com/office/word/2018/wordml/cex" xmlns:w16cid="http://schemas.microsoft.com/office/word/2016/wordml/cid" xmlns:w16="http://schemas.microsoft.com/office/word/2018/wordml" xmlns:w16du="http://schemas.microsoft.com/office/word/2023/wordml/word16du" xmlns:w16sdtdh="http://schemas.microsoft.com/office/word/2020/wordml/sdtdatahash" xmlns:w16sdtfl="http://schemas.microsoft.com/office/word/2024/wordml/sdtformatlock" xmlns:w16se="http://schemas.microsoft.com/office/word/2015/wordml/symex" xmlns:wpg="http://schemas.microsoft.com/office/word/2010/wordprocessingGroup" xmlns:wpi="http://schemas.microsoft.com/office/word/2010/wordprocessingInk" xmlns:wne="http://schemas.microsoft.com/office/word/2006/wordml" xmlns:wps="http://schemas.microsoft.com/office/word/2010/wordprocessingShape" mc:Ignorable="w14 w15 w16se w16cid w16 w16cex w16sdtdh w16sdtfl w16du wp14">
   <w:body>
     <w:p/>
     <w:p/>
@@ -30,6 +30,7 @@
               <w:bCs/>
             </w:rPr>
           </w:pPr>
+          <w:proofErr w:type="spellStart"/>
           <w:r>
             <w:rPr>
               <w:b/>
@@ -37,6 +38,7 @@
             </w:rPr>
             <w:t>CurrentDate</w:t>
           </w:r>
+          <w:proofErr w:type="spellEnd"/>
         </w:p>
       </w:sdtContent>
     </w:sdt>
@@ -44,7 +46,12 @@
       <w:pPr>
         <w:tabs>
           <w:tab w:val="left" w:pos="1608"/>
+          <w:tab w:val="left" w:pos="2625"/>
         </w:tabs>
+        <w:rPr>
+          <w:b/>
+          <w:bCs/>
+        </w:rPr>
       </w:pPr>
       <w:r>
         <w:t xml:space="preserve">Dear </w:t>
@@ -65,15 +72,39 @@
           <w:text/>
         </w:sdtPr>
         <w:sdtContent>
+          <w:proofErr w:type="spellStart"/>
           <w:r>
             <w:rPr>
               <w:b/>
               <w:bCs/>
             </w:rPr>
-            <w:t>Customer_Name</w:t>
+            <w:t>Customer_Nam</w:t>
           </w:r>
+          <w:r>
+            <w:rPr>
+              <w:b/>
+              <w:bCs/>
+            </w:rPr>
+            <w:t>e</w:t>
+          </w:r>
+          <w:proofErr w:type="spellEnd"/>
         </w:sdtContent>
       </w:sdt>
+      <w:r>
+        <w:rPr>
+          <w:b/>
+          <w:bCs/>
+        </w:rPr>
+        <w:tab/>
+      </w:r>
+    </w:p>
+    <w:p>
+      <w:pPr>
+        <w:tabs>
+          <w:tab w:val="left" w:pos="1608"/>
+          <w:tab w:val="left" w:pos="2625"/>
+        </w:tabs>
+      </w:pPr>
     </w:p>
     <w:p>
       <w:pPr>
@@ -144,12 +175,14 @@
                 <w:text/>
               </w:sdtPr>
               <w:sdtContent>
+                <w:proofErr w:type="spellStart"/>
                 <w:r>
                   <w:rPr>
                     <w:bCs/>
                   </w:rPr>
                   <w:t>ProposalID</w:t>
                 </w:r>
+                <w:proofErr w:type="spellEnd"/>
               </w:sdtContent>
             </w:sdt>
             <w:r>
@@ -201,12 +234,14 @@
                 <w:text/>
               </w:sdtPr>
               <w:sdtContent>
+                <w:proofErr w:type="spellStart"/>
                 <w:r>
                   <w:rPr>
                     <w:bCs/>
                   </w:rPr>
                   <w:t>Property_Name</w:t>
                 </w:r>
+                <w:proofErr w:type="spellEnd"/>
               </w:sdtContent>
             </w:sdt>
             <w:r>
@@ -260,12 +295,14 @@
                 <w:text/>
               </w:sdtPr>
               <w:sdtContent>
+                <w:proofErr w:type="spellStart"/>
                 <w:r>
                   <w:rPr>
                     <w:bCs/>
                   </w:rPr>
                   <w:t>Start_Date</w:t>
                 </w:r>
+                <w:proofErr w:type="spellEnd"/>
               </w:sdtContent>
             </w:sdt>
           </w:p>
@@ -318,12 +355,14 @@
                 <w:text/>
               </w:sdtPr>
               <w:sdtContent>
+                <w:proofErr w:type="spellStart"/>
                 <w:r>
                   <w:rPr>
                     <w:bCs/>
                   </w:rPr>
                   <w:t>Unit_Name</w:t>
                 </w:r>
+                <w:proofErr w:type="spellEnd"/>
               </w:sdtContent>
             </w:sdt>
             <w:r>
@@ -376,12 +415,14 @@
                 <w:text/>
               </w:sdtPr>
               <w:sdtContent>
+                <w:proofErr w:type="spellStart"/>
                 <w:r>
                   <w:rPr>
                     <w:bCs/>
                   </w:rPr>
                   <w:t>End_Date</w:t>
                 </w:r>
+                <w:proofErr w:type="spellEnd"/>
               </w:sdtContent>
             </w:sdt>
           </w:p>
@@ -426,12 +467,14 @@
                 <w:text/>
               </w:sdtPr>
               <w:sdtContent>
+                <w:proofErr w:type="spellStart"/>
                 <w:r>
                   <w:rPr>
                     <w:bCs/>
                   </w:rPr>
                   <w:t>Unit_Size</w:t>
                 </w:r>
+                <w:proofErr w:type="spellEnd"/>
               </w:sdtContent>
             </w:sdt>
             <w:r>
@@ -611,8 +654,17 @@
                 <w:b/>
                 <w:bCs/>
               </w:rPr>
-              <w:t>Amount Incl.Tax</w:t>
+              <w:t xml:space="preserve">Amount </w:t>
             </w:r>
+            <w:proofErr w:type="spellStart"/>
+            <w:r>
+              <w:rPr>
+                <w:b/>
+                <w:bCs/>
+              </w:rPr>
+              <w:t>Incl.Tax</w:t>
+            </w:r>
+            <w:proofErr w:type="spellEnd"/>
           </w:p>
         </w:tc>
       </w:tr>
@@ -636,7 +688,7 @@
               <w:tcPr>
                 <w:tcW w:w="1612" w:type="dxa"/>
                 <w:tcBorders>
-                  <w:bottom w:val="single" w:color="auto" w:sz="4" w:space="0"/>
+                  <w:bottom w:val="single" w:sz="4" w:space="0" w:color="auto"/>
                 </w:tcBorders>
               </w:tcPr>
               <w:p>
@@ -650,8 +702,13 @@
                     <w:bCs/>
                   </w:rPr>
                 </w:pPr>
+                <w:proofErr w:type="spellStart"/>
                 <w:r>
-                  <w:t>Entry_No_</w:t>
+                  <w:t>Entry_No</w:t>
+                </w:r>
+                <w:proofErr w:type="spellEnd"/>
+                <w:r>
+                  <w:t>_</w:t>
                 </w:r>
               </w:p>
             </w:tc>
@@ -661,7 +718,7 @@
           <w:tcPr>
             <w:tcW w:w="4194" w:type="dxa"/>
             <w:tcBorders>
-              <w:bottom w:val="single" w:color="auto" w:sz="4" w:space="0"/>
+              <w:bottom w:val="single" w:sz="4" w:space="0" w:color="auto"/>
             </w:tcBorders>
           </w:tcPr>
           <w:p>
@@ -691,7 +748,7 @@
               <w:tcPr>
                 <w:tcW w:w="1246" w:type="dxa"/>
                 <w:tcBorders>
-                  <w:bottom w:val="single" w:color="auto" w:sz="4" w:space="0"/>
+                  <w:bottom w:val="single" w:sz="4" w:space="0" w:color="auto"/>
                 </w:tcBorders>
               </w:tcPr>
               <w:p>
@@ -705,9 +762,11 @@
                     <w:bCs/>
                   </w:rPr>
                 </w:pPr>
+                <w:proofErr w:type="spellStart"/>
                 <w:r>
                   <w:t>Annual_R_A</w:t>
                 </w:r>
+                <w:proofErr w:type="spellEnd"/>
               </w:p>
             </w:tc>
           </w:sdtContent>
@@ -728,7 +787,7 @@
               <w:tcPr>
                 <w:tcW w:w="1312" w:type="dxa"/>
                 <w:tcBorders>
-                  <w:bottom w:val="single" w:color="auto" w:sz="4" w:space="0"/>
+                  <w:bottom w:val="single" w:sz="4" w:space="0" w:color="auto"/>
                 </w:tcBorders>
               </w:tcPr>
               <w:p>
@@ -742,9 +801,11 @@
                     <w:bCs/>
                   </w:rPr>
                 </w:pPr>
+                <w:proofErr w:type="spellStart"/>
                 <w:r>
                   <w:t>Rent_VAT_A</w:t>
                 </w:r>
+                <w:proofErr w:type="spellEnd"/>
               </w:p>
             </w:tc>
           </w:sdtContent>
@@ -765,7 +826,7 @@
               <w:tcPr>
                 <w:tcW w:w="1842" w:type="dxa"/>
                 <w:tcBorders>
-                  <w:bottom w:val="single" w:color="auto" w:sz="4" w:space="0"/>
+                  <w:bottom w:val="single" w:sz="4" w:space="0" w:color="auto"/>
                 </w:tcBorders>
               </w:tcPr>
               <w:p>
@@ -779,9 +840,11 @@
                     <w:bCs/>
                   </w:rPr>
                 </w:pPr>
+                <w:proofErr w:type="spellStart"/>
                 <w:r>
                   <w:t>Rent_A_Incl_VAT</w:t>
                 </w:r>
+                <w:proofErr w:type="spellEnd"/>
               </w:p>
             </w:tc>
           </w:sdtContent>
@@ -796,7 +859,7 @@
             <w:tcW w:w="10206" w:type="dxa"/>
             <w:gridSpan w:val="5"/>
             <w:tcBorders>
-              <w:top w:val="single" w:color="auto" w:sz="4" w:space="0"/>
+              <w:top w:val="single" w:sz="4" w:space="0" w:color="auto"/>
               <w:left w:val="nil"/>
               <w:right w:val="nil"/>
             </w:tcBorders>
@@ -914,8 +977,17 @@
                 <w:b/>
                 <w:bCs/>
               </w:rPr>
-              <w:t>Amount Incl.Tax</w:t>
+              <w:t xml:space="preserve">Amount </w:t>
             </w:r>
+            <w:proofErr w:type="spellStart"/>
+            <w:r>
+              <w:rPr>
+                <w:b/>
+                <w:bCs/>
+              </w:rPr>
+              <w:t>Incl.Tax</w:t>
+            </w:r>
+            <w:proofErr w:type="spellEnd"/>
           </w:p>
         </w:tc>
       </w:tr>
@@ -924,7 +996,7 @@
           <w:alias w:val="#Nav: /TenancyContractSubpage"/>
           <w:tag w:val="#Nav: Other_Payment_Details/50110"/>
           <w:id w:val="-410616414"/>
-          <w15:dataBinding w:prefixMappings="xmlns:ns0='urn:microsoft-dynamics-nav/reports/Other_Payment_Details/50110/'" w:xpath="/ns0:NavWordReportXmlPart[1]/ns0:TenancyContractSubpage" w:storeItemID="{1B288537-E1B4-496E-895B-159FCB78FD89}"/>
+          <w15:dataBinding w:prefixMappings="xmlns:ns0='urn:microsoft-dynamics-nav/reports/Other_Payment_Details/50110/' " w:xpath="/ns0:NavWordReportXmlPart[1]/ns0:TenancyContractSubpage" w:storeItemID="{1B288537-E1B4-496E-895B-159FCB78FD89}"/>
           <w15:repeatingSection/>
         </w:sdtPr>
         <w:sdtContent>
@@ -961,8 +1033,13 @@
                         <w:pPr>
                           <w:jc w:val="center"/>
                         </w:pPr>
+                        <w:proofErr w:type="spellStart"/>
                         <w:r>
-                          <w:t>Entry_No_</w:t>
+                          <w:t>Entry_No</w:t>
+                        </w:r>
+                        <w:proofErr w:type="spellEnd"/>
+                        <w:r>
+                          <w:t>_</w:t>
                         </w:r>
                       </w:p>
                     </w:tc>
@@ -985,9 +1062,11 @@
                         <w:tcW w:w="4194" w:type="dxa"/>
                       </w:tcPr>
                       <w:p>
+                        <w:proofErr w:type="spellStart"/>
                         <w:r>
                           <w:t>Secondary_Item_Type</w:t>
                         </w:r>
+                        <w:proofErr w:type="spellEnd"/>
                       </w:p>
                     </w:tc>
                   </w:sdtContent>
@@ -1033,9 +1112,11 @@
                         <w:tcW w:w="1312" w:type="dxa"/>
                       </w:tcPr>
                       <w:p>
+                        <w:proofErr w:type="spellStart"/>
                         <w:r>
                           <w:t>VAT_Amount</w:t>
                         </w:r>
+                        <w:proofErr w:type="spellEnd"/>
                       </w:p>
                     </w:tc>
                   </w:sdtContent>
@@ -1057,9 +1138,11 @@
                         <w:tcW w:w="1842" w:type="dxa"/>
                       </w:tcPr>
                       <w:p>
+                        <w:proofErr w:type="spellStart"/>
                         <w:r>
                           <w:t>Amount_Including_VAT</w:t>
                         </w:r>
+                        <w:proofErr w:type="spellEnd"/>
                       </w:p>
                     </w:tc>
                   </w:sdtContent>
@@ -1131,6 +1214,7 @@
                   </w:tabs>
                   <w:jc w:val="right"/>
                 </w:pPr>
+                <w:proofErr w:type="spellStart"/>
                 <w:r>
                   <w:rPr>
                     <w:b/>
@@ -1138,6 +1222,7 @@
                   </w:rPr>
                   <w:t>Total_Amount</w:t>
                 </w:r>
+                <w:proofErr w:type="spellEnd"/>
               </w:p>
             </w:tc>
           </w:sdtContent>
@@ -1169,6 +1254,7 @@
                   </w:tabs>
                   <w:jc w:val="right"/>
                 </w:pPr>
+                <w:proofErr w:type="spellStart"/>
                 <w:r>
                   <w:rPr>
                     <w:b/>
@@ -1176,6 +1262,7 @@
                   </w:rPr>
                   <w:t>Total_VAT_Amount</w:t>
                 </w:r>
+                <w:proofErr w:type="spellEnd"/>
               </w:p>
             </w:tc>
           </w:sdtContent>
@@ -1207,6 +1294,7 @@
                   </w:tabs>
                   <w:jc w:val="right"/>
                 </w:pPr>
+                <w:proofErr w:type="spellStart"/>
                 <w:r>
                   <w:rPr>
                     <w:b/>
@@ -1214,6 +1302,7 @@
                   </w:rPr>
                   <w:t>Total_Amount_Including_VAT</w:t>
                 </w:r>
+                <w:proofErr w:type="spellEnd"/>
               </w:p>
             </w:tc>
           </w:sdtContent>
@@ -1296,6 +1385,7 @@
               <w:lang w:val="en-IN"/>
             </w:rPr>
           </w:pPr>
+          <w:proofErr w:type="spellStart"/>
           <w:r>
             <w:rPr>
               <w:b/>
@@ -1304,6 +1394,7 @@
             </w:rPr>
             <w:t>CompanyName</w:t>
           </w:r>
+          <w:proofErr w:type="spellEnd"/>
         </w:p>
       </w:sdtContent>
     </w:sdt>
@@ -1324,7 +1415,7 @@
 </file>
 
 <file path=word/endnotes.xml><?xml version="1.0" encoding="utf-8"?>
-<w:endnotes xmlns:wpc="http://schemas.microsoft.com/office/word/2010/wordprocessingCanvas" xmlns:cx="http://schemas.microsoft.com/office/drawing/2014/chartex" xmlns:cx1="http://schemas.microsoft.com/office/drawing/2015/9/8/chartex" xmlns:cx2="http://schemas.microsoft.com/office/drawing/2015/10/21/chartex" xmlns:cx3="http://schemas.microsoft.com/office/drawing/2016/5/9/chartex" xmlns:cx4="http://schemas.microsoft.com/office/drawing/2016/5/10/chartex" xmlns:cx5="http://schemas.microsoft.com/office/drawing/2016/5/11/chartex" xmlns:cx6="http://schemas.microsoft.com/office/drawing/2016/5/12/chartex" xmlns:cx7="http://schemas.microsoft.com/office/drawing/2016/5/13/chartex" xmlns:cx8="http://schemas.microsoft.com/office/drawing/2016/5/14/chartex" xmlns:mc="http://schemas.openxmlformats.org/markup-compatibility/2006" xmlns:aink="http://schemas.microsoft.com/office/drawing/2016/ink" xmlns:am3d="http://schemas.microsoft.com/office/drawing/2017/model3d" xmlns:o="urn:schemas-microsoft-com:office:office" xmlns:oel="http://schemas.microsoft.com/office/2019/extlst" xmlns:r="http://schemas.openxmlformats.org/officeDocument/2006/relationships" xmlns:m="http://schemas.openxmlformats.org/officeDocument/2006/math" xmlns:v="urn:schemas-microsoft-com:vml" xmlns:wp14="http://schemas.microsoft.com/office/word/2010/wordprocessingDrawing" xmlns:wp="http://schemas.openxmlformats.org/drawingml/2006/wordprocessingDrawing" xmlns:w10="urn:schemas-microsoft-com:office:word" xmlns:w="http://schemas.openxmlformats.org/wordprocessingml/2006/main" xmlns:w14="http://schemas.microsoft.com/office/word/2010/wordml" xmlns:w15="http://schemas.microsoft.com/office/word/2012/wordml" xmlns:w16cex="http://schemas.microsoft.com/office/word/2018/wordml/cex" xmlns:w16cid="http://schemas.microsoft.com/office/word/2016/wordml/cid" xmlns:w16="http://schemas.microsoft.com/office/word/2018/wordml" xmlns:w16du="http://schemas.microsoft.com/office/word/2023/wordml/word16du" xmlns:w16sdtdh="http://schemas.microsoft.com/office/word/2020/wordml/sdtdatahash" xmlns:w16se="http://schemas.microsoft.com/office/word/2015/wordml/symex" xmlns:wpg="http://schemas.microsoft.com/office/word/2010/wordprocessingGroup" xmlns:wpi="http://schemas.microsoft.com/office/word/2010/wordprocessingInk" xmlns:wne="http://schemas.microsoft.com/office/word/2006/wordml" xmlns:wps="http://schemas.microsoft.com/office/word/2010/wordprocessingShape" mc:Ignorable="w14 w15 w16se w16cid w16 w16cex w16sdtdh w16du wp14">
+<w:endnotes xmlns:wpc="http://schemas.microsoft.com/office/word/2010/wordprocessingCanvas" xmlns:cx="http://schemas.microsoft.com/office/drawing/2014/chartex" xmlns:cx1="http://schemas.microsoft.com/office/drawing/2015/9/8/chartex" xmlns:cx2="http://schemas.microsoft.com/office/drawing/2015/10/21/chartex" xmlns:cx3="http://schemas.microsoft.com/office/drawing/2016/5/9/chartex" xmlns:cx4="http://schemas.microsoft.com/office/drawing/2016/5/10/chartex" xmlns:cx5="http://schemas.microsoft.com/office/drawing/2016/5/11/chartex" xmlns:cx6="http://schemas.microsoft.com/office/drawing/2016/5/12/chartex" xmlns:cx7="http://schemas.microsoft.com/office/drawing/2016/5/13/chartex" xmlns:cx8="http://schemas.microsoft.com/office/drawing/2016/5/14/chartex" xmlns:mc="http://schemas.openxmlformats.org/markup-compatibility/2006" xmlns:aink="http://schemas.microsoft.com/office/drawing/2016/ink" xmlns:am3d="http://schemas.microsoft.com/office/drawing/2017/model3d" xmlns:o="urn:schemas-microsoft-com:office:office" xmlns:oel="http://schemas.microsoft.com/office/2019/extlst" xmlns:r="http://schemas.openxmlformats.org/officeDocument/2006/relationships" xmlns:m="http://schemas.openxmlformats.org/officeDocument/2006/math" xmlns:v="urn:schemas-microsoft-com:vml" xmlns:wp14="http://schemas.microsoft.com/office/word/2010/wordprocessingDrawing" xmlns:wp="http://schemas.openxmlformats.org/drawingml/2006/wordprocessingDrawing" xmlns:w10="urn:schemas-microsoft-com:office:word" xmlns:w="http://schemas.openxmlformats.org/wordprocessingml/2006/main" xmlns:w14="http://schemas.microsoft.com/office/word/2010/wordml" xmlns:w15="http://schemas.microsoft.com/office/word/2012/wordml" xmlns:w16cex="http://schemas.microsoft.com/office/word/2018/wordml/cex" xmlns:w16cid="http://schemas.microsoft.com/office/word/2016/wordml/cid" xmlns:w16="http://schemas.microsoft.com/office/word/2018/wordml" xmlns:w16du="http://schemas.microsoft.com/office/word/2023/wordml/word16du" xmlns:w16sdtdh="http://schemas.microsoft.com/office/word/2020/wordml/sdtdatahash" xmlns:w16sdtfl="http://schemas.microsoft.com/office/word/2024/wordml/sdtformatlock" xmlns:w16se="http://schemas.microsoft.com/office/word/2015/wordml/symex" xmlns:wpg="http://schemas.microsoft.com/office/word/2010/wordprocessingGroup" xmlns:wpi="http://schemas.microsoft.com/office/word/2010/wordprocessingInk" xmlns:wne="http://schemas.microsoft.com/office/word/2006/wordml" xmlns:wps="http://schemas.microsoft.com/office/word/2010/wordprocessingShape" mc:Ignorable="w14 w15 w16se w16cid w16 w16cex w16sdtdh w16sdtfl w16du wp14">
   <w:endnote w:type="separator" w:id="-1">
     <w:p>
       <w:pPr>
@@ -1349,7 +1440,7 @@
 </file>
 
 <file path=word/footer1.xml><?xml version="1.0" encoding="utf-8"?>
-<w:ftr xmlns:wpc="http://schemas.microsoft.com/office/word/2010/wordprocessingCanvas" xmlns:cx="http://schemas.microsoft.com/office/drawing/2014/chartex" xmlns:cx1="http://schemas.microsoft.com/office/drawing/2015/9/8/chartex" xmlns:cx2="http://schemas.microsoft.com/office/drawing/2015/10/21/chartex" xmlns:cx3="http://schemas.microsoft.com/office/drawing/2016/5/9/chartex" xmlns:cx4="http://schemas.microsoft.com/office/drawing/2016/5/10/chartex" xmlns:cx5="http://schemas.microsoft.com/office/drawing/2016/5/11/chartex" xmlns:cx6="http://schemas.microsoft.com/office/drawing/2016/5/12/chartex" xmlns:cx7="http://schemas.microsoft.com/office/drawing/2016/5/13/chartex" xmlns:cx8="http://schemas.microsoft.com/office/drawing/2016/5/14/chartex" xmlns:mc="http://schemas.openxmlformats.org/markup-compatibility/2006" xmlns:aink="http://schemas.microsoft.com/office/drawing/2016/ink" xmlns:am3d="http://schemas.microsoft.com/office/drawing/2017/model3d" xmlns:o="urn:schemas-microsoft-com:office:office" xmlns:oel="http://schemas.microsoft.com/office/2019/extlst" xmlns:r="http://schemas.openxmlformats.org/officeDocument/2006/relationships" xmlns:m="http://schemas.openxmlformats.org/officeDocument/2006/math" xmlns:v="urn:schemas-microsoft-com:vml" xmlns:wp14="http://schemas.microsoft.com/office/word/2010/wordprocessingDrawing" xmlns:wp="http://schemas.openxmlformats.org/drawingml/2006/wordprocessingDrawing" xmlns:w10="urn:schemas-microsoft-com:office:word" xmlns:w="http://schemas.openxmlformats.org/wordprocessingml/2006/main" xmlns:w14="http://schemas.microsoft.com/office/word/2010/wordml" xmlns:w15="http://schemas.microsoft.com/office/word/2012/wordml" xmlns:w16cex="http://schemas.microsoft.com/office/word/2018/wordml/cex" xmlns:w16cid="http://schemas.microsoft.com/office/word/2016/wordml/cid" xmlns:w16="http://schemas.microsoft.com/office/word/2018/wordml" xmlns:w16du="http://schemas.microsoft.com/office/word/2023/wordml/word16du" xmlns:w16sdtdh="http://schemas.microsoft.com/office/word/2020/wordml/sdtdatahash" xmlns:w16se="http://schemas.microsoft.com/office/word/2015/wordml/symex" xmlns:wpg="http://schemas.microsoft.com/office/word/2010/wordprocessingGroup" xmlns:wpi="http://schemas.microsoft.com/office/word/2010/wordprocessingInk" xmlns:wne="http://schemas.microsoft.com/office/word/2006/wordml" xmlns:wps="http://schemas.microsoft.com/office/word/2010/wordprocessingShape" mc:Ignorable="w14 w15 w16se w16cid w16 w16cex w16sdtdh w16du wp14">
+<w:ftr xmlns:wpc="http://schemas.microsoft.com/office/word/2010/wordprocessingCanvas" xmlns:cx="http://schemas.microsoft.com/office/drawing/2014/chartex" xmlns:cx1="http://schemas.microsoft.com/office/drawing/2015/9/8/chartex" xmlns:cx2="http://schemas.microsoft.com/office/drawing/2015/10/21/chartex" xmlns:cx3="http://schemas.microsoft.com/office/drawing/2016/5/9/chartex" xmlns:cx4="http://schemas.microsoft.com/office/drawing/2016/5/10/chartex" xmlns:cx5="http://schemas.microsoft.com/office/drawing/2016/5/11/chartex" xmlns:cx6="http://schemas.microsoft.com/office/drawing/2016/5/12/chartex" xmlns:cx7="http://schemas.microsoft.com/office/drawing/2016/5/13/chartex" xmlns:cx8="http://schemas.microsoft.com/office/drawing/2016/5/14/chartex" xmlns:mc="http://schemas.openxmlformats.org/markup-compatibility/2006" xmlns:aink="http://schemas.microsoft.com/office/drawing/2016/ink" xmlns:am3d="http://schemas.microsoft.com/office/drawing/2017/model3d" xmlns:o="urn:schemas-microsoft-com:office:office" xmlns:oel="http://schemas.microsoft.com/office/2019/extlst" xmlns:r="http://schemas.openxmlformats.org/officeDocument/2006/relationships" xmlns:m="http://schemas.openxmlformats.org/officeDocument/2006/math" xmlns:v="urn:schemas-microsoft-com:vml" xmlns:wp14="http://schemas.microsoft.com/office/word/2010/wordprocessingDrawing" xmlns:wp="http://schemas.openxmlformats.org/drawingml/2006/wordprocessingDrawing" xmlns:w10="urn:schemas-microsoft-com:office:word" xmlns:w="http://schemas.openxmlformats.org/wordprocessingml/2006/main" xmlns:w14="http://schemas.microsoft.com/office/word/2010/wordml" xmlns:w15="http://schemas.microsoft.com/office/word/2012/wordml" xmlns:w16cex="http://schemas.microsoft.com/office/word/2018/wordml/cex" xmlns:w16cid="http://schemas.microsoft.com/office/word/2016/wordml/cid" xmlns:w16="http://schemas.microsoft.com/office/word/2018/wordml" xmlns:w16du="http://schemas.microsoft.com/office/word/2023/wordml/word16du" xmlns:w16sdtdh="http://schemas.microsoft.com/office/word/2020/wordml/sdtdatahash" xmlns:w16sdtfl="http://schemas.microsoft.com/office/word/2024/wordml/sdtformatlock" xmlns:w16se="http://schemas.microsoft.com/office/word/2015/wordml/symex" xmlns:wpg="http://schemas.microsoft.com/office/word/2010/wordprocessingGroup" xmlns:wpi="http://schemas.microsoft.com/office/word/2010/wordprocessingInk" xmlns:wne="http://schemas.microsoft.com/office/word/2006/wordml" xmlns:wps="http://schemas.microsoft.com/office/word/2010/wordprocessingShape" mc:Ignorable="w14 w15 w16se w16cid w16 w16cex w16sdtdh w16sdtfl w16du wp14">
   <w:p>
     <w:pPr>
       <w:pStyle w:val="Footer"/>
@@ -1359,7 +1450,7 @@
 </file>
 
 <file path=word/footer2.xml><?xml version="1.0" encoding="utf-8"?>
-<w:ftr xmlns:wpc="http://schemas.microsoft.com/office/word/2010/wordprocessingCanvas" xmlns:cx="http://schemas.microsoft.com/office/drawing/2014/chartex" xmlns:cx1="http://schemas.microsoft.com/office/drawing/2015/9/8/chartex" xmlns:cx2="http://schemas.microsoft.com/office/drawing/2015/10/21/chartex" xmlns:cx3="http://schemas.microsoft.com/office/drawing/2016/5/9/chartex" xmlns:cx4="http://schemas.microsoft.com/office/drawing/2016/5/10/chartex" xmlns:cx5="http://schemas.microsoft.com/office/drawing/2016/5/11/chartex" xmlns:cx6="http://schemas.microsoft.com/office/drawing/2016/5/12/chartex" xmlns:cx7="http://schemas.microsoft.com/office/drawing/2016/5/13/chartex" xmlns:cx8="http://schemas.microsoft.com/office/drawing/2016/5/14/chartex" xmlns:mc="http://schemas.openxmlformats.org/markup-compatibility/2006" xmlns:aink="http://schemas.microsoft.com/office/drawing/2016/ink" xmlns:am3d="http://schemas.microsoft.com/office/drawing/2017/model3d" xmlns:o="urn:schemas-microsoft-com:office:office" xmlns:oel="http://schemas.microsoft.com/office/2019/extlst" xmlns:r="http://schemas.openxmlformats.org/officeDocument/2006/relationships" xmlns:m="http://schemas.openxmlformats.org/officeDocument/2006/math" xmlns:v="urn:schemas-microsoft-com:vml" xmlns:wp14="http://schemas.microsoft.com/office/word/2010/wordprocessingDrawing" xmlns:wp="http://schemas.openxmlformats.org/drawingml/2006/wordprocessingDrawing" xmlns:w10="urn:schemas-microsoft-com:office:word" xmlns:w="http://schemas.openxmlformats.org/wordprocessingml/2006/main" xmlns:w14="http://schemas.microsoft.com/office/word/2010/wordml" xmlns:w15="http://schemas.microsoft.com/office/word/2012/wordml" xmlns:w16cex="http://schemas.microsoft.com/office/word/2018/wordml/cex" xmlns:w16cid="http://schemas.microsoft.com/office/word/2016/wordml/cid" xmlns:w16="http://schemas.microsoft.com/office/word/2018/wordml" xmlns:w16du="http://schemas.microsoft.com/office/word/2023/wordml/word16du" xmlns:w16sdtdh="http://schemas.microsoft.com/office/word/2020/wordml/sdtdatahash" xmlns:w16se="http://schemas.microsoft.com/office/word/2015/wordml/symex" xmlns:wpg="http://schemas.microsoft.com/office/word/2010/wordprocessingGroup" xmlns:wpi="http://schemas.microsoft.com/office/word/2010/wordprocessingInk" xmlns:wne="http://schemas.microsoft.com/office/word/2006/wordml" xmlns:wps="http://schemas.microsoft.com/office/word/2010/wordprocessingShape" mc:Ignorable="w14 w15 w16se w16cid w16 w16cex w16sdtdh w16du wp14">
+<w:ftr xmlns:wpc="http://schemas.microsoft.com/office/word/2010/wordprocessingCanvas" xmlns:cx="http://schemas.microsoft.com/office/drawing/2014/chartex" xmlns:cx1="http://schemas.microsoft.com/office/drawing/2015/9/8/chartex" xmlns:cx2="http://schemas.microsoft.com/office/drawing/2015/10/21/chartex" xmlns:cx3="http://schemas.microsoft.com/office/drawing/2016/5/9/chartex" xmlns:cx4="http://schemas.microsoft.com/office/drawing/2016/5/10/chartex" xmlns:cx5="http://schemas.microsoft.com/office/drawing/2016/5/11/chartex" xmlns:cx6="http://schemas.microsoft.com/office/drawing/2016/5/12/chartex" xmlns:cx7="http://schemas.microsoft.com/office/drawing/2016/5/13/chartex" xmlns:cx8="http://schemas.microsoft.com/office/drawing/2016/5/14/chartex" xmlns:mc="http://schemas.openxmlformats.org/markup-compatibility/2006" xmlns:aink="http://schemas.microsoft.com/office/drawing/2016/ink" xmlns:am3d="http://schemas.microsoft.com/office/drawing/2017/model3d" xmlns:o="urn:schemas-microsoft-com:office:office" xmlns:oel="http://schemas.microsoft.com/office/2019/extlst" xmlns:r="http://schemas.openxmlformats.org/officeDocument/2006/relationships" xmlns:m="http://schemas.openxmlformats.org/officeDocument/2006/math" xmlns:v="urn:schemas-microsoft-com:vml" xmlns:wp14="http://schemas.microsoft.com/office/word/2010/wordprocessingDrawing" xmlns:wp="http://schemas.openxmlformats.org/drawingml/2006/wordprocessingDrawing" xmlns:w10="urn:schemas-microsoft-com:office:word" xmlns:w="http://schemas.openxmlformats.org/wordprocessingml/2006/main" xmlns:w14="http://schemas.microsoft.com/office/word/2010/wordml" xmlns:w15="http://schemas.microsoft.com/office/word/2012/wordml" xmlns:w16cex="http://schemas.microsoft.com/office/word/2018/wordml/cex" xmlns:w16cid="http://schemas.microsoft.com/office/word/2016/wordml/cid" xmlns:w16="http://schemas.microsoft.com/office/word/2018/wordml" xmlns:w16du="http://schemas.microsoft.com/office/word/2023/wordml/word16du" xmlns:w16sdtdh="http://schemas.microsoft.com/office/word/2020/wordml/sdtdatahash" xmlns:w16sdtfl="http://schemas.microsoft.com/office/word/2024/wordml/sdtformatlock" xmlns:w16se="http://schemas.microsoft.com/office/word/2015/wordml/symex" xmlns:wpg="http://schemas.microsoft.com/office/word/2010/wordprocessingGroup" xmlns:wpi="http://schemas.microsoft.com/office/word/2010/wordprocessingInk" xmlns:wne="http://schemas.microsoft.com/office/word/2006/wordml" xmlns:wps="http://schemas.microsoft.com/office/word/2010/wordprocessingShape" mc:Ignorable="w14 w15 w16se w16cid w16 w16cex w16sdtdh w16sdtfl w16du wp14">
   <w:p>
     <w:pPr>
       <w:pStyle w:val="Footer"/>
@@ -1369,7 +1460,7 @@
 </file>
 
 <file path=word/footer3.xml><?xml version="1.0" encoding="utf-8"?>
-<w:ftr xmlns:wpc="http://schemas.microsoft.com/office/word/2010/wordprocessingCanvas" xmlns:cx="http://schemas.microsoft.com/office/drawing/2014/chartex" xmlns:cx1="http://schemas.microsoft.com/office/drawing/2015/9/8/chartex" xmlns:cx2="http://schemas.microsoft.com/office/drawing/2015/10/21/chartex" xmlns:cx3="http://schemas.microsoft.com/office/drawing/2016/5/9/chartex" xmlns:cx4="http://schemas.microsoft.com/office/drawing/2016/5/10/chartex" xmlns:cx5="http://schemas.microsoft.com/office/drawing/2016/5/11/chartex" xmlns:cx6="http://schemas.microsoft.com/office/drawing/2016/5/12/chartex" xmlns:cx7="http://schemas.microsoft.com/office/drawing/2016/5/13/chartex" xmlns:cx8="http://schemas.microsoft.com/office/drawing/2016/5/14/chartex" xmlns:mc="http://schemas.openxmlformats.org/markup-compatibility/2006" xmlns:aink="http://schemas.microsoft.com/office/drawing/2016/ink" xmlns:am3d="http://schemas.microsoft.com/office/drawing/2017/model3d" xmlns:o="urn:schemas-microsoft-com:office:office" xmlns:oel="http://schemas.microsoft.com/office/2019/extlst" xmlns:r="http://schemas.openxmlformats.org/officeDocument/2006/relationships" xmlns:m="http://schemas.openxmlformats.org/officeDocument/2006/math" xmlns:v="urn:schemas-microsoft-com:vml" xmlns:wp14="http://schemas.microsoft.com/office/word/2010/wordprocessingDrawing" xmlns:wp="http://schemas.openxmlformats.org/drawingml/2006/wordprocessingDrawing" xmlns:w10="urn:schemas-microsoft-com:office:word" xmlns:w="http://schemas.openxmlformats.org/wordprocessingml/2006/main" xmlns:w14="http://schemas.microsoft.com/office/word/2010/wordml" xmlns:w15="http://schemas.microsoft.com/office/word/2012/wordml" xmlns:w16cex="http://schemas.microsoft.com/office/word/2018/wordml/cex" xmlns:w16cid="http://schemas.microsoft.com/office/word/2016/wordml/cid" xmlns:w16="http://schemas.microsoft.com/office/word/2018/wordml" xmlns:w16du="http://schemas.microsoft.com/office/word/2023/wordml/word16du" xmlns:w16sdtdh="http://schemas.microsoft.com/office/word/2020/wordml/sdtdatahash" xmlns:w16se="http://schemas.microsoft.com/office/word/2015/wordml/symex" xmlns:wpg="http://schemas.microsoft.com/office/word/2010/wordprocessingGroup" xmlns:wpi="http://schemas.microsoft.com/office/word/2010/wordprocessingInk" xmlns:wne="http://schemas.microsoft.com/office/word/2006/wordml" xmlns:wps="http://schemas.microsoft.com/office/word/2010/wordprocessingShape" mc:Ignorable="w14 w15 w16se w16cid w16 w16cex w16sdtdh w16du wp14">
+<w:ftr xmlns:wpc="http://schemas.microsoft.com/office/word/2010/wordprocessingCanvas" xmlns:cx="http://schemas.microsoft.com/office/drawing/2014/chartex" xmlns:cx1="http://schemas.microsoft.com/office/drawing/2015/9/8/chartex" xmlns:cx2="http://schemas.microsoft.com/office/drawing/2015/10/21/chartex" xmlns:cx3="http://schemas.microsoft.com/office/drawing/2016/5/9/chartex" xmlns:cx4="http://schemas.microsoft.com/office/drawing/2016/5/10/chartex" xmlns:cx5="http://schemas.microsoft.com/office/drawing/2016/5/11/chartex" xmlns:cx6="http://schemas.microsoft.com/office/drawing/2016/5/12/chartex" xmlns:cx7="http://schemas.microsoft.com/office/drawing/2016/5/13/chartex" xmlns:cx8="http://schemas.microsoft.com/office/drawing/2016/5/14/chartex" xmlns:mc="http://schemas.openxmlformats.org/markup-compatibility/2006" xmlns:aink="http://schemas.microsoft.com/office/drawing/2016/ink" xmlns:am3d="http://schemas.microsoft.com/office/drawing/2017/model3d" xmlns:o="urn:schemas-microsoft-com:office:office" xmlns:oel="http://schemas.microsoft.com/office/2019/extlst" xmlns:r="http://schemas.openxmlformats.org/officeDocument/2006/relationships" xmlns:m="http://schemas.openxmlformats.org/officeDocument/2006/math" xmlns:v="urn:schemas-microsoft-com:vml" xmlns:wp14="http://schemas.microsoft.com/office/word/2010/wordprocessingDrawing" xmlns:wp="http://schemas.openxmlformats.org/drawingml/2006/wordprocessingDrawing" xmlns:w10="urn:schemas-microsoft-com:office:word" xmlns:w="http://schemas.openxmlformats.org/wordprocessingml/2006/main" xmlns:w14="http://schemas.microsoft.com/office/word/2010/wordml" xmlns:w15="http://schemas.microsoft.com/office/word/2012/wordml" xmlns:w16cex="http://schemas.microsoft.com/office/word/2018/wordml/cex" xmlns:w16cid="http://schemas.microsoft.com/office/word/2016/wordml/cid" xmlns:w16="http://schemas.microsoft.com/office/word/2018/wordml" xmlns:w16du="http://schemas.microsoft.com/office/word/2023/wordml/word16du" xmlns:w16sdtdh="http://schemas.microsoft.com/office/word/2020/wordml/sdtdatahash" xmlns:w16sdtfl="http://schemas.microsoft.com/office/word/2024/wordml/sdtformatlock" xmlns:w16se="http://schemas.microsoft.com/office/word/2015/wordml/symex" xmlns:wpg="http://schemas.microsoft.com/office/word/2010/wordprocessingGroup" xmlns:wpi="http://schemas.microsoft.com/office/word/2010/wordprocessingInk" xmlns:wne="http://schemas.microsoft.com/office/word/2006/wordml" xmlns:wps="http://schemas.microsoft.com/office/word/2010/wordprocessingShape" mc:Ignorable="w14 w15 w16se w16cid w16 w16cex w16sdtdh w16sdtfl w16du wp14">
   <w:p>
     <w:pPr>
       <w:pStyle w:val="Footer"/>
@@ -1379,7 +1470,7 @@
 </file>
 
 <file path=word/footnotes.xml><?xml version="1.0" encoding="utf-8"?>
-<w:footnotes xmlns:wpc="http://schemas.microsoft.com/office/word/2010/wordprocessingCanvas" xmlns:cx="http://schemas.microsoft.com/office/drawing/2014/chartex" xmlns:cx1="http://schemas.microsoft.com/office/drawing/2015/9/8/chartex" xmlns:cx2="http://schemas.microsoft.com/office/drawing/2015/10/21/chartex" xmlns:cx3="http://schemas.microsoft.com/office/drawing/2016/5/9/chartex" xmlns:cx4="http://schemas.microsoft.com/office/drawing/2016/5/10/chartex" xmlns:cx5="http://schemas.microsoft.com/office/drawing/2016/5/11/chartex" xmlns:cx6="http://schemas.microsoft.com/office/drawing/2016/5/12/chartex" xmlns:cx7="http://schemas.microsoft.com/office/drawing/2016/5/13/chartex" xmlns:cx8="http://schemas.microsoft.com/office/drawing/2016/5/14/chartex" xmlns:mc="http://schemas.openxmlformats.org/markup-compatibility/2006" xmlns:aink="http://schemas.microsoft.com/office/drawing/2016/ink" xmlns:am3d="http://schemas.microsoft.com/office/drawing/2017/model3d" xmlns:o="urn:schemas-microsoft-com:office:office" xmlns:oel="http://schemas.microsoft.com/office/2019/extlst" xmlns:r="http://schemas.openxmlformats.org/officeDocument/2006/relationships" xmlns:m="http://schemas.openxmlformats.org/officeDocument/2006/math" xmlns:v="urn:schemas-microsoft-com:vml" xmlns:wp14="http://schemas.microsoft.com/office/word/2010/wordprocessingDrawing" xmlns:wp="http://schemas.openxmlformats.org/drawingml/2006/wordprocessingDrawing" xmlns:w10="urn:schemas-microsoft-com:office:word" xmlns:w="http://schemas.openxmlformats.org/wordprocessingml/2006/main" xmlns:w14="http://schemas.microsoft.com/office/word/2010/wordml" xmlns:w15="http://schemas.microsoft.com/office/word/2012/wordml" xmlns:w16cex="http://schemas.microsoft.com/office/word/2018/wordml/cex" xmlns:w16cid="http://schemas.microsoft.com/office/word/2016/wordml/cid" xmlns:w16="http://schemas.microsoft.com/office/word/2018/wordml" xmlns:w16du="http://schemas.microsoft.com/office/word/2023/wordml/word16du" xmlns:w16sdtdh="http://schemas.microsoft.com/office/word/2020/wordml/sdtdatahash" xmlns:w16se="http://schemas.microsoft.com/office/word/2015/wordml/symex" xmlns:wpg="http://schemas.microsoft.com/office/word/2010/wordprocessingGroup" xmlns:wpi="http://schemas.microsoft.com/office/word/2010/wordprocessingInk" xmlns:wne="http://schemas.microsoft.com/office/word/2006/wordml" xmlns:wps="http://schemas.microsoft.com/office/word/2010/wordprocessingShape" mc:Ignorable="w14 w15 w16se w16cid w16 w16cex w16sdtdh w16du wp14">
+<w:footnotes xmlns:wpc="http://schemas.microsoft.com/office/word/2010/wordprocessingCanvas" xmlns:cx="http://schemas.microsoft.com/office/drawing/2014/chartex" xmlns:cx1="http://schemas.microsoft.com/office/drawing/2015/9/8/chartex" xmlns:cx2="http://schemas.microsoft.com/office/drawing/2015/10/21/chartex" xmlns:cx3="http://schemas.microsoft.com/office/drawing/2016/5/9/chartex" xmlns:cx4="http://schemas.microsoft.com/office/drawing/2016/5/10/chartex" xmlns:cx5="http://schemas.microsoft.com/office/drawing/2016/5/11/chartex" xmlns:cx6="http://schemas.microsoft.com/office/drawing/2016/5/12/chartex" xmlns:cx7="http://schemas.microsoft.com/office/drawing/2016/5/13/chartex" xmlns:cx8="http://schemas.microsoft.com/office/drawing/2016/5/14/chartex" xmlns:mc="http://schemas.openxmlformats.org/markup-compatibility/2006" xmlns:aink="http://schemas.microsoft.com/office/drawing/2016/ink" xmlns:am3d="http://schemas.microsoft.com/office/drawing/2017/model3d" xmlns:o="urn:schemas-microsoft-com:office:office" xmlns:oel="http://schemas.microsoft.com/office/2019/extlst" xmlns:r="http://schemas.openxmlformats.org/officeDocument/2006/relationships" xmlns:m="http://schemas.openxmlformats.org/officeDocument/2006/math" xmlns:v="urn:schemas-microsoft-com:vml" xmlns:wp14="http://schemas.microsoft.com/office/word/2010/wordprocessingDrawing" xmlns:wp="http://schemas.openxmlformats.org/drawingml/2006/wordprocessingDrawing" xmlns:w10="urn:schemas-microsoft-com:office:word" xmlns:w="http://schemas.openxmlformats.org/wordprocessingml/2006/main" xmlns:w14="http://schemas.microsoft.com/office/word/2010/wordml" xmlns:w15="http://schemas.microsoft.com/office/word/2012/wordml" xmlns:w16cex="http://schemas.microsoft.com/office/word/2018/wordml/cex" xmlns:w16cid="http://schemas.microsoft.com/office/word/2016/wordml/cid" xmlns:w16="http://schemas.microsoft.com/office/word/2018/wordml" xmlns:w16du="http://schemas.microsoft.com/office/word/2023/wordml/word16du" xmlns:w16sdtdh="http://schemas.microsoft.com/office/word/2020/wordml/sdtdatahash" xmlns:w16sdtfl="http://schemas.microsoft.com/office/word/2024/wordml/sdtformatlock" xmlns:w16se="http://schemas.microsoft.com/office/word/2015/wordml/symex" xmlns:wpg="http://schemas.microsoft.com/office/word/2010/wordprocessingGroup" xmlns:wpi="http://schemas.microsoft.com/office/word/2010/wordprocessingInk" xmlns:wne="http://schemas.microsoft.com/office/word/2006/wordml" xmlns:wps="http://schemas.microsoft.com/office/word/2010/wordprocessingShape" mc:Ignorable="w14 w15 w16se w16cid w16 w16cex w16sdtdh w16sdtfl w16du wp14">
   <w:footnote w:type="separator" w:id="-1">
     <w:p>
       <w:pPr>
@@ -1404,7 +1495,7 @@
 </file>
 
 <file path=word/header1.xml><?xml version="1.0" encoding="utf-8"?>
-<w:hdr xmlns:wpc="http://schemas.microsoft.com/office/word/2010/wordprocessingCanvas" xmlns:cx="http://schemas.microsoft.com/office/drawing/2014/chartex" xmlns:cx1="http://schemas.microsoft.com/office/drawing/2015/9/8/chartex" xmlns:cx2="http://schemas.microsoft.com/office/drawing/2015/10/21/chartex" xmlns:cx3="http://schemas.microsoft.com/office/drawing/2016/5/9/chartex" xmlns:cx4="http://schemas.microsoft.com/office/drawing/2016/5/10/chartex" xmlns:cx5="http://schemas.microsoft.com/office/drawing/2016/5/11/chartex" xmlns:cx6="http://schemas.microsoft.com/office/drawing/2016/5/12/chartex" xmlns:cx7="http://schemas.microsoft.com/office/drawing/2016/5/13/chartex" xmlns:cx8="http://schemas.microsoft.com/office/drawing/2016/5/14/chartex" xmlns:mc="http://schemas.openxmlformats.org/markup-compatibility/2006" xmlns:aink="http://schemas.microsoft.com/office/drawing/2016/ink" xmlns:am3d="http://schemas.microsoft.com/office/drawing/2017/model3d" xmlns:o="urn:schemas-microsoft-com:office:office" xmlns:oel="http://schemas.microsoft.com/office/2019/extlst" xmlns:r="http://schemas.openxmlformats.org/officeDocument/2006/relationships" xmlns:m="http://schemas.openxmlformats.org/officeDocument/2006/math" xmlns:v="urn:schemas-microsoft-com:vml" xmlns:wp14="http://schemas.microsoft.com/office/word/2010/wordprocessingDrawing" xmlns:wp="http://schemas.openxmlformats.org/drawingml/2006/wordprocessingDrawing" xmlns:w10="urn:schemas-microsoft-com:office:word" xmlns:w="http://schemas.openxmlformats.org/wordprocessingml/2006/main" xmlns:w14="http://schemas.microsoft.com/office/word/2010/wordml" xmlns:w15="http://schemas.microsoft.com/office/word/2012/wordml" xmlns:w16cex="http://schemas.microsoft.com/office/word/2018/wordml/cex" xmlns:w16cid="http://schemas.microsoft.com/office/word/2016/wordml/cid" xmlns:w16="http://schemas.microsoft.com/office/word/2018/wordml" xmlns:w16du="http://schemas.microsoft.com/office/word/2023/wordml/word16du" xmlns:w16sdtdh="http://schemas.microsoft.com/office/word/2020/wordml/sdtdatahash" xmlns:w16se="http://schemas.microsoft.com/office/word/2015/wordml/symex" xmlns:wpg="http://schemas.microsoft.com/office/word/2010/wordprocessingGroup" xmlns:wpi="http://schemas.microsoft.com/office/word/2010/wordprocessingInk" xmlns:wne="http://schemas.microsoft.com/office/word/2006/wordml" xmlns:wps="http://schemas.microsoft.com/office/word/2010/wordprocessingShape" mc:Ignorable="w14 w15 w16se w16cid w16 w16cex w16sdtdh w16du wp14">
+<w:hdr xmlns:wpc="http://schemas.microsoft.com/office/word/2010/wordprocessingCanvas" xmlns:cx="http://schemas.microsoft.com/office/drawing/2014/chartex" xmlns:cx1="http://schemas.microsoft.com/office/drawing/2015/9/8/chartex" xmlns:cx2="http://schemas.microsoft.com/office/drawing/2015/10/21/chartex" xmlns:cx3="http://schemas.microsoft.com/office/drawing/2016/5/9/chartex" xmlns:cx4="http://schemas.microsoft.com/office/drawing/2016/5/10/chartex" xmlns:cx5="http://schemas.microsoft.com/office/drawing/2016/5/11/chartex" xmlns:cx6="http://schemas.microsoft.com/office/drawing/2016/5/12/chartex" xmlns:cx7="http://schemas.microsoft.com/office/drawing/2016/5/13/chartex" xmlns:cx8="http://schemas.microsoft.com/office/drawing/2016/5/14/chartex" xmlns:mc="http://schemas.openxmlformats.org/markup-compatibility/2006" xmlns:aink="http://schemas.microsoft.com/office/drawing/2016/ink" xmlns:am3d="http://schemas.microsoft.com/office/drawing/2017/model3d" xmlns:o="urn:schemas-microsoft-com:office:office" xmlns:oel="http://schemas.microsoft.com/office/2019/extlst" xmlns:r="http://schemas.openxmlformats.org/officeDocument/2006/relationships" xmlns:m="http://schemas.openxmlformats.org/officeDocument/2006/math" xmlns:v="urn:schemas-microsoft-com:vml" xmlns:wp14="http://schemas.microsoft.com/office/word/2010/wordprocessingDrawing" xmlns:wp="http://schemas.openxmlformats.org/drawingml/2006/wordprocessingDrawing" xmlns:w10="urn:schemas-microsoft-com:office:word" xmlns:w="http://schemas.openxmlformats.org/wordprocessingml/2006/main" xmlns:w14="http://schemas.microsoft.com/office/word/2010/wordml" xmlns:w15="http://schemas.microsoft.com/office/word/2012/wordml" xmlns:w16cex="http://schemas.microsoft.com/office/word/2018/wordml/cex" xmlns:w16cid="http://schemas.microsoft.com/office/word/2016/wordml/cid" xmlns:w16="http://schemas.microsoft.com/office/word/2018/wordml" xmlns:w16du="http://schemas.microsoft.com/office/word/2023/wordml/word16du" xmlns:w16sdtdh="http://schemas.microsoft.com/office/word/2020/wordml/sdtdatahash" xmlns:w16sdtfl="http://schemas.microsoft.com/office/word/2024/wordml/sdtformatlock" xmlns:w16se="http://schemas.microsoft.com/office/word/2015/wordml/symex" xmlns:wpg="http://schemas.microsoft.com/office/word/2010/wordprocessingGroup" xmlns:wpi="http://schemas.microsoft.com/office/word/2010/wordprocessingInk" xmlns:wne="http://schemas.microsoft.com/office/word/2006/wordml" xmlns:wps="http://schemas.microsoft.com/office/word/2010/wordprocessingShape" mc:Ignorable="w14 w15 w16se w16cid w16 w16cex w16sdtdh w16sdtfl w16du wp14">
   <w:p>
     <w:pPr>
       <w:pStyle w:val="Header"/>
@@ -1414,7 +1505,7 @@
 </file>
 
 <file path=word/header2.xml><?xml version="1.0" encoding="utf-8"?>
-<w:hdr xmlns:a="http://schemas.openxmlformats.org/drawingml/2006/main" xmlns:pic="http://schemas.openxmlformats.org/drawingml/2006/picture" xmlns:wpc="http://schemas.microsoft.com/office/word/2010/wordprocessingCanvas" xmlns:cx="http://schemas.microsoft.com/office/drawing/2014/chartex" xmlns:cx1="http://schemas.microsoft.com/office/drawing/2015/9/8/chartex" xmlns:cx2="http://schemas.microsoft.com/office/drawing/2015/10/21/chartex" xmlns:cx3="http://schemas.microsoft.com/office/drawing/2016/5/9/chartex" xmlns:cx4="http://schemas.microsoft.com/office/drawing/2016/5/10/chartex" xmlns:cx5="http://schemas.microsoft.com/office/drawing/2016/5/11/chartex" xmlns:cx6="http://schemas.microsoft.com/office/drawing/2016/5/12/chartex" xmlns:cx7="http://schemas.microsoft.com/office/drawing/2016/5/13/chartex" xmlns:cx8="http://schemas.microsoft.com/office/drawing/2016/5/14/chartex" xmlns:mc="http://schemas.openxmlformats.org/markup-compatibility/2006" xmlns:aink="http://schemas.microsoft.com/office/drawing/2016/ink" xmlns:am3d="http://schemas.microsoft.com/office/drawing/2017/model3d" xmlns:o="urn:schemas-microsoft-com:office:office" xmlns:oel="http://schemas.microsoft.com/office/2019/extlst" xmlns:r="http://schemas.openxmlformats.org/officeDocument/2006/relationships" xmlns:m="http://schemas.openxmlformats.org/officeDocument/2006/math" xmlns:v="urn:schemas-microsoft-com:vml" xmlns:wp14="http://schemas.microsoft.com/office/word/2010/wordprocessingDrawing" xmlns:wp="http://schemas.openxmlformats.org/drawingml/2006/wordprocessingDrawing" xmlns:w10="urn:schemas-microsoft-com:office:word" xmlns:w="http://schemas.openxmlformats.org/wordprocessingml/2006/main" xmlns:w14="http://schemas.microsoft.com/office/word/2010/wordml" xmlns:w15="http://schemas.microsoft.com/office/word/2012/wordml" xmlns:w16cex="http://schemas.microsoft.com/office/word/2018/wordml/cex" xmlns:w16cid="http://schemas.microsoft.com/office/word/2016/wordml/cid" xmlns:w16="http://schemas.microsoft.com/office/word/2018/wordml" xmlns:w16du="http://schemas.microsoft.com/office/word/2023/wordml/word16du" xmlns:w16sdtdh="http://schemas.microsoft.com/office/word/2020/wordml/sdtdatahash" xmlns:w16se="http://schemas.microsoft.com/office/word/2015/wordml/symex" xmlns:wpg="http://schemas.microsoft.com/office/word/2010/wordprocessingGroup" xmlns:wpi="http://schemas.microsoft.com/office/word/2010/wordprocessingInk" xmlns:wne="http://schemas.microsoft.com/office/word/2006/wordml" xmlns:wps="http://schemas.microsoft.com/office/word/2010/wordprocessingShape" mc:Ignorable="w14 w15 w16se w16cid w16 w16cex w16sdtdh w16du wp14">
+<w:hdr xmlns:wpc="http://schemas.microsoft.com/office/word/2010/wordprocessingCanvas" xmlns:cx="http://schemas.microsoft.com/office/drawing/2014/chartex" xmlns:cx1="http://schemas.microsoft.com/office/drawing/2015/9/8/chartex" xmlns:cx2="http://schemas.microsoft.com/office/drawing/2015/10/21/chartex" xmlns:cx3="http://schemas.microsoft.com/office/drawing/2016/5/9/chartex" xmlns:cx4="http://schemas.microsoft.com/office/drawing/2016/5/10/chartex" xmlns:cx5="http://schemas.microsoft.com/office/drawing/2016/5/11/chartex" xmlns:cx6="http://schemas.microsoft.com/office/drawing/2016/5/12/chartex" xmlns:cx7="http://schemas.microsoft.com/office/drawing/2016/5/13/chartex" xmlns:cx8="http://schemas.microsoft.com/office/drawing/2016/5/14/chartex" xmlns:mc="http://schemas.openxmlformats.org/markup-compatibility/2006" xmlns:aink="http://schemas.microsoft.com/office/drawing/2016/ink" xmlns:am3d="http://schemas.microsoft.com/office/drawing/2017/model3d" xmlns:o="urn:schemas-microsoft-com:office:office" xmlns:oel="http://schemas.microsoft.com/office/2019/extlst" xmlns:r="http://schemas.openxmlformats.org/officeDocument/2006/relationships" xmlns:m="http://schemas.openxmlformats.org/officeDocument/2006/math" xmlns:v="urn:schemas-microsoft-com:vml" xmlns:wp14="http://schemas.microsoft.com/office/word/2010/wordprocessingDrawing" xmlns:wp="http://schemas.openxmlformats.org/drawingml/2006/wordprocessingDrawing" xmlns:w10="urn:schemas-microsoft-com:office:word" xmlns:w="http://schemas.openxmlformats.org/wordprocessingml/2006/main" xmlns:w14="http://schemas.microsoft.com/office/word/2010/wordml" xmlns:w15="http://schemas.microsoft.com/office/word/2012/wordml" xmlns:w16cex="http://schemas.microsoft.com/office/word/2018/wordml/cex" xmlns:w16cid="http://schemas.microsoft.com/office/word/2016/wordml/cid" xmlns:w16="http://schemas.microsoft.com/office/word/2018/wordml" xmlns:w16du="http://schemas.microsoft.com/office/word/2023/wordml/word16du" xmlns:w16sdtdh="http://schemas.microsoft.com/office/word/2020/wordml/sdtdatahash" xmlns:w16sdtfl="http://schemas.microsoft.com/office/word/2024/wordml/sdtformatlock" xmlns:w16se="http://schemas.microsoft.com/office/word/2015/wordml/symex" xmlns:wpg="http://schemas.microsoft.com/office/word/2010/wordprocessingGroup" xmlns:wpi="http://schemas.microsoft.com/office/word/2010/wordprocessingInk" xmlns:wne="http://schemas.microsoft.com/office/word/2006/wordml" xmlns:wps="http://schemas.microsoft.com/office/word/2010/wordprocessingShape" mc:Ignorable="w14 w15 w16se w16cid w16 w16cex w16sdtdh w16sdtfl w16du wp14">
   <w:sdt>
     <w:sdtPr>
       <w:alias w:val="#Nav: /TenancyContractSubpage/CompanyPicture"/>
@@ -1434,7 +1525,7 @@
           </w:rPr>
           <w:drawing>
             <wp:inline distT="0" distB="0" distL="0" distR="0" wp14:anchorId="5FE11997" wp14:editId="08484F5E">
-              <wp:extent cx="2537460" cy="952500"/>
+              <wp:extent cx="952500" cy="952500"/>
               <wp:effectExtent l="0" t="0" r="0" b="0"/>
               <wp:docPr id="1" name="Picture 1"/>
               <wp:cNvGraphicFramePr>
@@ -1458,7 +1549,7 @@
                     <pic:spPr bwMode="auto">
                       <a:xfrm>
                         <a:off x="0" y="0"/>
-                        <a:ext cx="2537460" cy="952500"/>
+                        <a:ext cx="952500" cy="952500"/>
                       </a:xfrm>
                       <a:prstGeom prst="rect">
                         <a:avLst/>
@@ -1481,7 +1572,7 @@
 </file>
 
 <file path=word/header3.xml><?xml version="1.0" encoding="utf-8"?>
-<w:hdr xmlns:wpc="http://schemas.microsoft.com/office/word/2010/wordprocessingCanvas" xmlns:cx="http://schemas.microsoft.com/office/drawing/2014/chartex" xmlns:cx1="http://schemas.microsoft.com/office/drawing/2015/9/8/chartex" xmlns:cx2="http://schemas.microsoft.com/office/drawing/2015/10/21/chartex" xmlns:cx3="http://schemas.microsoft.com/office/drawing/2016/5/9/chartex" xmlns:cx4="http://schemas.microsoft.com/office/drawing/2016/5/10/chartex" xmlns:cx5="http://schemas.microsoft.com/office/drawing/2016/5/11/chartex" xmlns:cx6="http://schemas.microsoft.com/office/drawing/2016/5/12/chartex" xmlns:cx7="http://schemas.microsoft.com/office/drawing/2016/5/13/chartex" xmlns:cx8="http://schemas.microsoft.com/office/drawing/2016/5/14/chartex" xmlns:mc="http://schemas.openxmlformats.org/markup-compatibility/2006" xmlns:aink="http://schemas.microsoft.com/office/drawing/2016/ink" xmlns:am3d="http://schemas.microsoft.com/office/drawing/2017/model3d" xmlns:o="urn:schemas-microsoft-com:office:office" xmlns:oel="http://schemas.microsoft.com/office/2019/extlst" xmlns:r="http://schemas.openxmlformats.org/officeDocument/2006/relationships" xmlns:m="http://schemas.openxmlformats.org/officeDocument/2006/math" xmlns:v="urn:schemas-microsoft-com:vml" xmlns:wp14="http://schemas.microsoft.com/office/word/2010/wordprocessingDrawing" xmlns:wp="http://schemas.openxmlformats.org/drawingml/2006/wordprocessingDrawing" xmlns:w10="urn:schemas-microsoft-com:office:word" xmlns:w="http://schemas.openxmlformats.org/wordprocessingml/2006/main" xmlns:w14="http://schemas.microsoft.com/office/word/2010/wordml" xmlns:w15="http://schemas.microsoft.com/office/word/2012/wordml" xmlns:w16cex="http://schemas.microsoft.com/office/word/2018/wordml/cex" xmlns:w16cid="http://schemas.microsoft.com/office/word/2016/wordml/cid" xmlns:w16="http://schemas.microsoft.com/office/word/2018/wordml" xmlns:w16du="http://schemas.microsoft.com/office/word/2023/wordml/word16du" xmlns:w16sdtdh="http://schemas.microsoft.com/office/word/2020/wordml/sdtdatahash" xmlns:w16se="http://schemas.microsoft.com/office/word/2015/wordml/symex" xmlns:wpg="http://schemas.microsoft.com/office/word/2010/wordprocessingGroup" xmlns:wpi="http://schemas.microsoft.com/office/word/2010/wordprocessingInk" xmlns:wne="http://schemas.microsoft.com/office/word/2006/wordml" xmlns:wps="http://schemas.microsoft.com/office/word/2010/wordprocessingShape" mc:Ignorable="w14 w15 w16se w16cid w16 w16cex w16sdtdh w16du wp14">
+<w:hdr xmlns:wpc="http://schemas.microsoft.com/office/word/2010/wordprocessingCanvas" xmlns:cx="http://schemas.microsoft.com/office/drawing/2014/chartex" xmlns:cx1="http://schemas.microsoft.com/office/drawing/2015/9/8/chartex" xmlns:cx2="http://schemas.microsoft.com/office/drawing/2015/10/21/chartex" xmlns:cx3="http://schemas.microsoft.com/office/drawing/2016/5/9/chartex" xmlns:cx4="http://schemas.microsoft.com/office/drawing/2016/5/10/chartex" xmlns:cx5="http://schemas.microsoft.com/office/drawing/2016/5/11/chartex" xmlns:cx6="http://schemas.microsoft.com/office/drawing/2016/5/12/chartex" xmlns:cx7="http://schemas.microsoft.com/office/drawing/2016/5/13/chartex" xmlns:cx8="http://schemas.microsoft.com/office/drawing/2016/5/14/chartex" xmlns:mc="http://schemas.openxmlformats.org/markup-compatibility/2006" xmlns:aink="http://schemas.microsoft.com/office/drawing/2016/ink" xmlns:am3d="http://schemas.microsoft.com/office/drawing/2017/model3d" xmlns:o="urn:schemas-microsoft-com:office:office" xmlns:oel="http://schemas.microsoft.com/office/2019/extlst" xmlns:r="http://schemas.openxmlformats.org/officeDocument/2006/relationships" xmlns:m="http://schemas.openxmlformats.org/officeDocument/2006/math" xmlns:v="urn:schemas-microsoft-com:vml" xmlns:wp14="http://schemas.microsoft.com/office/word/2010/wordprocessingDrawing" xmlns:wp="http://schemas.openxmlformats.org/drawingml/2006/wordprocessingDrawing" xmlns:w10="urn:schemas-microsoft-com:office:word" xmlns:w="http://schemas.openxmlformats.org/wordprocessingml/2006/main" xmlns:w14="http://schemas.microsoft.com/office/word/2010/wordml" xmlns:w15="http://schemas.microsoft.com/office/word/2012/wordml" xmlns:w16cex="http://schemas.microsoft.com/office/word/2018/wordml/cex" xmlns:w16cid="http://schemas.microsoft.com/office/word/2016/wordml/cid" xmlns:w16="http://schemas.microsoft.com/office/word/2018/wordml" xmlns:w16du="http://schemas.microsoft.com/office/word/2023/wordml/word16du" xmlns:w16sdtdh="http://schemas.microsoft.com/office/word/2020/wordml/sdtdatahash" xmlns:w16sdtfl="http://schemas.microsoft.com/office/word/2024/wordml/sdtformatlock" xmlns:w16se="http://schemas.microsoft.com/office/word/2015/wordml/symex" xmlns:wpg="http://schemas.microsoft.com/office/word/2010/wordprocessingGroup" xmlns:wpi="http://schemas.microsoft.com/office/word/2010/wordprocessingInk" xmlns:wne="http://schemas.microsoft.com/office/word/2006/wordml" xmlns:wps="http://schemas.microsoft.com/office/word/2010/wordprocessingShape" mc:Ignorable="w14 w15 w16se w16cid w16 w16cex w16sdtdh w16sdtfl w16du wp14">
   <w:p>
     <w:pPr>
       <w:pStyle w:val="Header"/>
@@ -1491,7 +1582,7 @@
 </file>
 
 <file path=word/styles.xml><?xml version="1.0" encoding="utf-8"?>
-<w:styles xmlns:mc="http://schemas.openxmlformats.org/markup-compatibility/2006" xmlns:r="http://schemas.openxmlformats.org/officeDocument/2006/relationships" xmlns:w="http://schemas.openxmlformats.org/wordprocessingml/2006/main" xmlns:w14="http://schemas.microsoft.com/office/word/2010/wordml" xmlns:w15="http://schemas.microsoft.com/office/word/2012/wordml" xmlns:w16cex="http://schemas.microsoft.com/office/word/2018/wordml/cex" xmlns:w16cid="http://schemas.microsoft.com/office/word/2016/wordml/cid" xmlns:w16="http://schemas.microsoft.com/office/word/2018/wordml" xmlns:w16du="http://schemas.microsoft.com/office/word/2023/wordml/word16du" xmlns:w16sdtdh="http://schemas.microsoft.com/office/word/2020/wordml/sdtdatahash" xmlns:w16se="http://schemas.microsoft.com/office/word/2015/wordml/symex" mc:Ignorable="w14 w15 w16se w16cid w16 w16cex w16sdtdh w16du">
+<w:styles xmlns:mc="http://schemas.openxmlformats.org/markup-compatibility/2006" xmlns:r="http://schemas.openxmlformats.org/officeDocument/2006/relationships" xmlns:w="http://schemas.openxmlformats.org/wordprocessingml/2006/main" xmlns:w14="http://schemas.microsoft.com/office/word/2010/wordml" xmlns:w15="http://schemas.microsoft.com/office/word/2012/wordml" xmlns:w16cex="http://schemas.microsoft.com/office/word/2018/wordml/cex" xmlns:w16cid="http://schemas.microsoft.com/office/word/2016/wordml/cid" xmlns:w16="http://schemas.microsoft.com/office/word/2018/wordml" xmlns:w16du="http://schemas.microsoft.com/office/word/2023/wordml/word16du" xmlns:w16sdtdh="http://schemas.microsoft.com/office/word/2020/wordml/sdtdatahash" xmlns:w16sdtfl="http://schemas.microsoft.com/office/word/2024/wordml/sdtformatlock" xmlns:w16se="http://schemas.microsoft.com/office/word/2015/wordml/symex" mc:Ignorable="w14 w15 w16se w16cid w16 w16cex w16sdtdh w16sdtfl w16du">
   <w:docDefaults>
     <w:rPrDefault>
       <w:rPr>
@@ -1995,7 +2086,7 @@
 </file>
 
 <file path=word/glossary/document.xml><?xml version="1.0" encoding="utf-8"?>
-<w:glossaryDocument xmlns:wpc="http://schemas.microsoft.com/office/word/2010/wordprocessingCanvas" xmlns:cx="http://schemas.microsoft.com/office/drawing/2014/chartex" xmlns:cx1="http://schemas.microsoft.com/office/drawing/2015/9/8/chartex" xmlns:cx2="http://schemas.microsoft.com/office/drawing/2015/10/21/chartex" xmlns:cx3="http://schemas.microsoft.com/office/drawing/2016/5/9/chartex" xmlns:cx4="http://schemas.microsoft.com/office/drawing/2016/5/10/chartex" xmlns:cx5="http://schemas.microsoft.com/office/drawing/2016/5/11/chartex" xmlns:cx6="http://schemas.microsoft.com/office/drawing/2016/5/12/chartex" xmlns:cx7="http://schemas.microsoft.com/office/drawing/2016/5/13/chartex" xmlns:cx8="http://schemas.microsoft.com/office/drawing/2016/5/14/chartex" xmlns:mc="http://schemas.openxmlformats.org/markup-compatibility/2006" xmlns:aink="http://schemas.microsoft.com/office/drawing/2016/ink" xmlns:am3d="http://schemas.microsoft.com/office/drawing/2017/model3d" xmlns:o="urn:schemas-microsoft-com:office:office" xmlns:oel="http://schemas.microsoft.com/office/2019/extlst" xmlns:r="http://schemas.openxmlformats.org/officeDocument/2006/relationships" xmlns:m="http://schemas.openxmlformats.org/officeDocument/2006/math" xmlns:v="urn:schemas-microsoft-com:vml" xmlns:wp14="http://schemas.microsoft.com/office/word/2010/wordprocessingDrawing" xmlns:wp="http://schemas.openxmlformats.org/drawingml/2006/wordprocessingDrawing" xmlns:w10="urn:schemas-microsoft-com:office:word" xmlns:w="http://schemas.openxmlformats.org/wordprocessingml/2006/main" xmlns:w14="http://schemas.microsoft.com/office/word/2010/wordml" xmlns:w15="http://schemas.microsoft.com/office/word/2012/wordml" xmlns:w16cex="http://schemas.microsoft.com/office/word/2018/wordml/cex" xmlns:w16cid="http://schemas.microsoft.com/office/word/2016/wordml/cid" xmlns:w16="http://schemas.microsoft.com/office/word/2018/wordml" xmlns:w16du="http://schemas.microsoft.com/office/word/2023/wordml/word16du" xmlns:w16sdtdh="http://schemas.microsoft.com/office/word/2020/wordml/sdtdatahash" xmlns:w16se="http://schemas.microsoft.com/office/word/2015/wordml/symex" xmlns:wpg="http://schemas.microsoft.com/office/word/2010/wordprocessingGroup" xmlns:wpi="http://schemas.microsoft.com/office/word/2010/wordprocessingInk" xmlns:wne="http://schemas.microsoft.com/office/word/2006/wordml" xmlns:wps="http://schemas.microsoft.com/office/word/2010/wordprocessingShape" mc:Ignorable="w14 w15 w16se w16cid w16 w16cex w16sdtdh w16du wp14">
+<w:glossaryDocument xmlns:wpc="http://schemas.microsoft.com/office/word/2010/wordprocessingCanvas" xmlns:cx="http://schemas.microsoft.com/office/drawing/2014/chartex" xmlns:cx1="http://schemas.microsoft.com/office/drawing/2015/9/8/chartex" xmlns:cx2="http://schemas.microsoft.com/office/drawing/2015/10/21/chartex" xmlns:cx3="http://schemas.microsoft.com/office/drawing/2016/5/9/chartex" xmlns:cx4="http://schemas.microsoft.com/office/drawing/2016/5/10/chartex" xmlns:cx5="http://schemas.microsoft.com/office/drawing/2016/5/11/chartex" xmlns:cx6="http://schemas.microsoft.com/office/drawing/2016/5/12/chartex" xmlns:cx7="http://schemas.microsoft.com/office/drawing/2016/5/13/chartex" xmlns:cx8="http://schemas.microsoft.com/office/drawing/2016/5/14/chartex" xmlns:mc="http://schemas.openxmlformats.org/markup-compatibility/2006" xmlns:aink="http://schemas.microsoft.com/office/drawing/2016/ink" xmlns:am3d="http://schemas.microsoft.com/office/drawing/2017/model3d" xmlns:o="urn:schemas-microsoft-com:office:office" xmlns:oel="http://schemas.microsoft.com/office/2019/extlst" xmlns:r="http://schemas.openxmlformats.org/officeDocument/2006/relationships" xmlns:m="http://schemas.openxmlformats.org/officeDocument/2006/math" xmlns:v="urn:schemas-microsoft-com:vml" xmlns:wp14="http://schemas.microsoft.com/office/word/2010/wordprocessingDrawing" xmlns:wp="http://schemas.openxmlformats.org/drawingml/2006/wordprocessingDrawing" xmlns:w10="urn:schemas-microsoft-com:office:word" xmlns:w="http://schemas.openxmlformats.org/wordprocessingml/2006/main" xmlns:w14="http://schemas.microsoft.com/office/word/2010/wordml" xmlns:w15="http://schemas.microsoft.com/office/word/2012/wordml" xmlns:w16cex="http://schemas.microsoft.com/office/word/2018/wordml/cex" xmlns:w16cid="http://schemas.microsoft.com/office/word/2016/wordml/cid" xmlns:w16="http://schemas.microsoft.com/office/word/2018/wordml" xmlns:w16du="http://schemas.microsoft.com/office/word/2023/wordml/word16du" xmlns:w16sdtdh="http://schemas.microsoft.com/office/word/2020/wordml/sdtdatahash" xmlns:w16sdtfl="http://schemas.microsoft.com/office/word/2024/wordml/sdtformatlock" xmlns:w16se="http://schemas.microsoft.com/office/word/2015/wordml/symex" xmlns:wpg="http://schemas.microsoft.com/office/word/2010/wordprocessingGroup" xmlns:wpi="http://schemas.microsoft.com/office/word/2010/wordprocessingInk" xmlns:wne="http://schemas.microsoft.com/office/word/2006/wordml" xmlns:wps="http://schemas.microsoft.com/office/word/2010/wordprocessingShape" mc:Ignorable="w14 w15 w16se w16cid w16 w16cex w16sdtdh w16sdtfl w16du wp14">
   <w:docParts>
     <w:docPart>
       <w:docPartPr>
@@ -2083,13 +2174,13 @@
 </file>
 
 <file path=word/glossary/fontTable.xml><?xml version="1.0" encoding="utf-8"?>
-<w:fonts xmlns:mc="http://schemas.openxmlformats.org/markup-compatibility/2006" xmlns:r="http://schemas.openxmlformats.org/officeDocument/2006/relationships" xmlns:w="http://schemas.openxmlformats.org/wordprocessingml/2006/main" xmlns:w14="http://schemas.microsoft.com/office/word/2010/wordml" xmlns:w15="http://schemas.microsoft.com/office/word/2012/wordml" xmlns:w16cex="http://schemas.microsoft.com/office/word/2018/wordml/cex" xmlns:w16cid="http://schemas.microsoft.com/office/word/2016/wordml/cid" xmlns:w16="http://schemas.microsoft.com/office/word/2018/wordml" xmlns:w16du="http://schemas.microsoft.com/office/word/2023/wordml/word16du" xmlns:w16sdtdh="http://schemas.microsoft.com/office/word/2020/wordml/sdtdatahash" xmlns:w16se="http://schemas.microsoft.com/office/word/2015/wordml/symex" mc:Ignorable="w14 w15 w16se w16cid w16 w16cex w16sdtdh w16du">
+<w:fonts xmlns:mc="http://schemas.openxmlformats.org/markup-compatibility/2006" xmlns:r="http://schemas.openxmlformats.org/officeDocument/2006/relationships" xmlns:w="http://schemas.openxmlformats.org/wordprocessingml/2006/main" xmlns:w14="http://schemas.microsoft.com/office/word/2010/wordml" xmlns:w15="http://schemas.microsoft.com/office/word/2012/wordml" xmlns:w16cex="http://schemas.microsoft.com/office/word/2018/wordml/cex" xmlns:w16cid="http://schemas.microsoft.com/office/word/2016/wordml/cid" xmlns:w16="http://schemas.microsoft.com/office/word/2018/wordml" xmlns:w16du="http://schemas.microsoft.com/office/word/2023/wordml/word16du" xmlns:w16sdtdh="http://schemas.microsoft.com/office/word/2020/wordml/sdtdatahash" xmlns:w16sdtfl="http://schemas.microsoft.com/office/word/2024/wordml/sdtformatlock" xmlns:w16se="http://schemas.microsoft.com/office/word/2015/wordml/symex" mc:Ignorable="w14 w15 w16se w16cid w16 w16cex w16sdtdh w16sdtfl w16du">
   <w:font w:name="Calibri">
     <w:panose1 w:val="020F0502020204030204"/>
     <w:charset w:val="00"/>
     <w:family w:val="swiss"/>
     <w:pitch w:val="variable"/>
-    <w:sig w:usb0="E4002EFF" w:usb1="C200247B" w:usb2="00000009" w:usb3="00000000" w:csb0="000001FF" w:csb1="00000000"/>
+    <w:sig w:usb0="E4002EFF" w:usb1="C000247B" w:usb2="00000009" w:usb3="00000000" w:csb0="000001FF" w:csb1="00000000"/>
   </w:font>
   <w:font w:name="Times New Roman">
     <w:panose1 w:val="02020603050405020304"/>
@@ -2103,13 +2194,13 @@
     <w:charset w:val="00"/>
     <w:family w:val="swiss"/>
     <w:pitch w:val="variable"/>
-    <w:sig w:usb0="E4002EFF" w:usb1="C200247B" w:usb2="00000009" w:usb3="00000000" w:csb0="000001FF" w:csb1="00000000"/>
+    <w:sig w:usb0="E4002EFF" w:usb1="C000247B" w:usb2="00000009" w:usb3="00000000" w:csb0="000001FF" w:csb1="00000000"/>
   </w:font>
 </w:fonts>
 </file>
 
 <file path=word/glossary/settings.xml><?xml version="1.0" encoding="utf-8"?>
-<w:settings xmlns:mc="http://schemas.openxmlformats.org/markup-compatibility/2006" xmlns:o="urn:schemas-microsoft-com:office:office" xmlns:r="http://schemas.openxmlformats.org/officeDocument/2006/relationships" xmlns:m="http://schemas.openxmlformats.org/officeDocument/2006/math" xmlns:v="urn:schemas-microsoft-com:vml" xmlns:w10="urn:schemas-microsoft-com:office:word" xmlns:w="http://schemas.openxmlformats.org/wordprocessingml/2006/main" xmlns:w14="http://schemas.microsoft.com/office/word/2010/wordml" xmlns:w15="http://schemas.microsoft.com/office/word/2012/wordml" xmlns:w16cex="http://schemas.microsoft.com/office/word/2018/wordml/cex" xmlns:w16cid="http://schemas.microsoft.com/office/word/2016/wordml/cid" xmlns:w16="http://schemas.microsoft.com/office/word/2018/wordml" xmlns:w16du="http://schemas.microsoft.com/office/word/2023/wordml/word16du" xmlns:w16sdtdh="http://schemas.microsoft.com/office/word/2020/wordml/sdtdatahash" xmlns:w16se="http://schemas.microsoft.com/office/word/2015/wordml/symex" xmlns:sl="http://schemas.openxmlformats.org/schemaLibrary/2006/main" mc:Ignorable="w14 w15 w16se w16cid w16 w16cex w16sdtdh w16du">
+<w:settings xmlns:mc="http://schemas.openxmlformats.org/markup-compatibility/2006" xmlns:o="urn:schemas-microsoft-com:office:office" xmlns:r="http://schemas.openxmlformats.org/officeDocument/2006/relationships" xmlns:m="http://schemas.openxmlformats.org/officeDocument/2006/math" xmlns:v="urn:schemas-microsoft-com:vml" xmlns:w10="urn:schemas-microsoft-com:office:word" xmlns:w="http://schemas.openxmlformats.org/wordprocessingml/2006/main" xmlns:w14="http://schemas.microsoft.com/office/word/2010/wordml" xmlns:w15="http://schemas.microsoft.com/office/word/2012/wordml" xmlns:w16cex="http://schemas.microsoft.com/office/word/2018/wordml/cex" xmlns:w16cid="http://schemas.microsoft.com/office/word/2016/wordml/cid" xmlns:w16="http://schemas.microsoft.com/office/word/2018/wordml" xmlns:w16du="http://schemas.microsoft.com/office/word/2023/wordml/word16du" xmlns:w16sdtdh="http://schemas.microsoft.com/office/word/2020/wordml/sdtdatahash" xmlns:w16sdtfl="http://schemas.microsoft.com/office/word/2024/wordml/sdtformatlock" xmlns:w16se="http://schemas.microsoft.com/office/word/2015/wordml/symex" xmlns:sl="http://schemas.openxmlformats.org/schemaLibrary/2006/main" mc:Ignorable="w14 w15 w16se w16cid w16 w16cex w16sdtdh w16sdtfl w16du">
   <w:view w:val="normal"/>
   <w:defaultTabStop w:val="720"/>
   <w:characterSpacingControl w:val="doNotCompress"/>
@@ -2134,9 +2225,11 @@
     <w:rsid w:val="001E6FAA"/>
     <w:rsid w:val="00245937"/>
     <w:rsid w:val="002F70B9"/>
+    <w:rsid w:val="00322690"/>
     <w:rsid w:val="003719A6"/>
     <w:rsid w:val="003C13F7"/>
     <w:rsid w:val="003D1928"/>
+    <w:rsid w:val="004A15F8"/>
     <w:rsid w:val="004E3FEC"/>
     <w:rsid w:val="00547C8D"/>
     <w:rsid w:val="00552E37"/>
@@ -2196,7 +2289,7 @@
 </file>
 
 <file path=word/glossary/styles.xml><?xml version="1.0" encoding="utf-8"?>
-<w:styles xmlns:mc="http://schemas.openxmlformats.org/markup-compatibility/2006" xmlns:r="http://schemas.openxmlformats.org/officeDocument/2006/relationships" xmlns:w="http://schemas.openxmlformats.org/wordprocessingml/2006/main" xmlns:w14="http://schemas.microsoft.com/office/word/2010/wordml" xmlns:w15="http://schemas.microsoft.com/office/word/2012/wordml" xmlns:w16cex="http://schemas.microsoft.com/office/word/2018/wordml/cex" xmlns:w16cid="http://schemas.microsoft.com/office/word/2016/wordml/cid" xmlns:w16="http://schemas.microsoft.com/office/word/2018/wordml" xmlns:w16du="http://schemas.microsoft.com/office/word/2023/wordml/word16du" xmlns:w16sdtdh="http://schemas.microsoft.com/office/word/2020/wordml/sdtdatahash" xmlns:w16se="http://schemas.microsoft.com/office/word/2015/wordml/symex" mc:Ignorable="w14 w15 w16se w16cid w16 w16cex w16sdtdh w16du">
+<w:styles xmlns:mc="http://schemas.openxmlformats.org/markup-compatibility/2006" xmlns:r="http://schemas.openxmlformats.org/officeDocument/2006/relationships" xmlns:w="http://schemas.openxmlformats.org/wordprocessingml/2006/main" xmlns:w14="http://schemas.microsoft.com/office/word/2010/wordml" xmlns:w15="http://schemas.microsoft.com/office/word/2012/wordml" xmlns:w16cex="http://schemas.microsoft.com/office/word/2018/wordml/cex" xmlns:w16cid="http://schemas.microsoft.com/office/word/2016/wordml/cid" xmlns:w16="http://schemas.microsoft.com/office/word/2018/wordml" xmlns:w16du="http://schemas.microsoft.com/office/word/2023/wordml/word16du" xmlns:w16sdtdh="http://schemas.microsoft.com/office/word/2020/wordml/sdtdatahash" xmlns:w16sdtfl="http://schemas.microsoft.com/office/word/2024/wordml/sdtformatlock" xmlns:w16se="http://schemas.microsoft.com/office/word/2015/wordml/symex" mc:Ignorable="w14 w15 w16se w16cid w16 w16cex w16sdtdh w16sdtfl w16du">
   <w:docDefaults>
     <w:rPrDefault>
       <w:rPr>
@@ -2641,7 +2734,7 @@
 </file>
 
 <file path=word/glossary/webSettings.xml><?xml version="1.0" encoding="utf-8"?>
-<w:webSettings xmlns:mc="http://schemas.openxmlformats.org/markup-compatibility/2006" xmlns:r="http://schemas.openxmlformats.org/officeDocument/2006/relationships" xmlns:w="http://schemas.openxmlformats.org/wordprocessingml/2006/main" xmlns:w14="http://schemas.microsoft.com/office/word/2010/wordml" xmlns:w15="http://schemas.microsoft.com/office/word/2012/wordml" xmlns:w16cex="http://schemas.microsoft.com/office/word/2018/wordml/cex" xmlns:w16cid="http://schemas.microsoft.com/office/word/2016/wordml/cid" xmlns:w16="http://schemas.microsoft.com/office/word/2018/wordml" xmlns:w16du="http://schemas.microsoft.com/office/word/2023/wordml/word16du" xmlns:w16sdtdh="http://schemas.microsoft.com/office/word/2020/wordml/sdtdatahash" xmlns:w16se="http://schemas.microsoft.com/office/word/2015/wordml/symex" mc:Ignorable="w14 w15 w16se w16cid w16 w16cex w16sdtdh w16du">
+<w:webSettings xmlns:mc="http://schemas.openxmlformats.org/markup-compatibility/2006" xmlns:r="http://schemas.openxmlformats.org/officeDocument/2006/relationships" xmlns:w="http://schemas.openxmlformats.org/wordprocessingml/2006/main" xmlns:w14="http://schemas.microsoft.com/office/word/2010/wordml" xmlns:w15="http://schemas.microsoft.com/office/word/2012/wordml" xmlns:w16cex="http://schemas.microsoft.com/office/word/2018/wordml/cex" xmlns:w16cid="http://schemas.microsoft.com/office/word/2016/wordml/cid" xmlns:w16="http://schemas.microsoft.com/office/word/2018/wordml" xmlns:w16du="http://schemas.microsoft.com/office/word/2023/wordml/word16du" xmlns:w16sdtdh="http://schemas.microsoft.com/office/word/2020/wordml/sdtdatahash" xmlns:w16sdtfl="http://schemas.microsoft.com/office/word/2024/wordml/sdtformatlock" xmlns:w16se="http://schemas.microsoft.com/office/word/2015/wordml/symex" mc:Ignorable="w14 w15 w16se w16cid w16 w16cex w16sdtdh w16sdtfl w16du">
   <w:optimizeForBrowser/>
   <w:allowPNG/>
 </w:webSettings>
@@ -2942,9 +3035,7 @@
 </a:theme>
 </file>
 
-<file path=customXml/item1.xml>��< ? x m l   v e r s i o n = " 1 . 0 "   e n c o d i n g = " u t f - 1 6 " ? > - 
- < N a v W o r d R e p o r t X m l P a r t   x m l n s = " u r n : m i c r o s o f t - d y n a m i c s - n a v / r e p o r t s / O t h e r _ P a y m e n t _ D e t a i l s / 5 0 1 1 0 / " > +<file path=customXml/item1.xml>��< ? x m l   v e r s i o n = " 1 . 0 "   e n c o d i n g = " u t f - 1 6 " ? > < N a v W o r d R e p o r t X m l P a r t   x m l n s = " u r n : m i c r o s o f t - d y n a m i c s - n a v / r e p o r t s / O t h e r _ P a y m e n t _ D e t a i l s / 5 0 1 1 0 / " >   
      < B C R e p o r t I n f o r m a t i o n >   

</xml_diff>